<commit_message>
[FEAT] - Implement follow-up flow for Crossref Api
</commit_message>
<xml_diff>
--- a/docs/openalex_pipeline_operations.docx
+++ b/docs/openalex_pipeline_operations.docx
@@ -4,53 +4,234 @@
   <w:body>
     <w:p>
       <w:pPr>
-        <w:pStyle w:val="Title"/>
-        <w:jc w:val="left"/>
+        <w:jc w:val="center"/>
       </w:pPr>
       <w:r>
-        <w:t>OpenAlex Pipeline Operations Guide</w:t>
+        <w:rPr>
+          <w:b/>
+          <w:color w:val="1F4D78"/>
+          <w:sz w:val="24"/>
+        </w:rPr>
+        <w:t>Scientific Journal Pipeline</w:t>
       </w:r>
     </w:p>
     <w:p>
       <w:pPr>
-        <w:pStyle w:val="Subtitle"/>
+        <w:jc w:val="center"/>
       </w:pPr>
       <w:r>
-        <w:t>Scientific Journal Publication Trend Tracking System</w:t>
-      </w:r>
-      <w:r>
         <w:rPr>
-          <w:i/>
+          <w:b/>
+          <w:color w:val="2E74B5"/>
+          <w:sz w:val="40"/>
         </w:rPr>
-        <w:br/>
-        <w:t>Version: Database v7 / OpenAlex works sync</w:t>
+        <w:t>Hướng Dẫn Vận Hành OpenAlex Pipeline</w:t>
       </w:r>
     </w:p>
     <w:p>
       <w:pPr>
-        <w:pStyle w:val="Callout"/>
+        <w:jc w:val="center"/>
       </w:pPr>
       <w:r>
         <w:rPr>
-          <w:b/>
+          <w:i/>
+          <w:sz w:val="22"/>
         </w:rPr>
-        <w:t xml:space="preserve">Purpose: </w:t>
-      </w:r>
-      <w:r>
-        <w:t>This document explains how to operate the local OpenAlex data pipeline: ingest, process, enrich, watermark, and resume incremental crawls for works, authors, and sources.</w:t>
+        <w:t>Cách ingest, process, enrich, resume, và kiểm tra OpenAlex works/authors/sources.</w:t>
       </w:r>
     </w:p>
+    <w:p/>
+    <w:tbl>
+      <w:tblPr>
+        <w:tblStyle w:val="TableGrid"/>
+        <w:tblW w:type="auto" w:w="0"/>
+        <w:jc w:val="center"/>
+        <w:tblLook w:firstColumn="1" w:firstRow="1" w:lastColumn="0" w:lastRow="0" w:noHBand="0" w:noVBand="1" w:val="04A0"/>
+      </w:tblPr>
+      <w:tblGrid>
+        <w:gridCol w:w="4680"/>
+        <w:gridCol w:w="4680"/>
+      </w:tblGrid>
+      <w:tr>
+        <w:tc>
+          <w:tcPr>
+            <w:tcW w:type="dxa" w:w="4680"/>
+            <w:vAlign w:val="center"/>
+            <w:shd w:fill="E8EEF5"/>
+          </w:tcPr>
+          <w:p>
+            <w:r/>
+            <w:r>
+              <w:rPr>
+                <w:b/>
+                <w:sz w:val="20"/>
+              </w:rPr>
+              <w:t>Thông tin</w:t>
+            </w:r>
+          </w:p>
+        </w:tc>
+        <w:tc>
+          <w:tcPr>
+            <w:tcW w:type="dxa" w:w="4680"/>
+            <w:vAlign w:val="center"/>
+            <w:shd w:fill="E8EEF5"/>
+          </w:tcPr>
+          <w:p>
+            <w:r/>
+            <w:r>
+              <w:rPr>
+                <w:b/>
+                <w:sz w:val="20"/>
+              </w:rPr>
+              <w:t>Giá trị</w:t>
+            </w:r>
+          </w:p>
+        </w:tc>
+      </w:tr>
+      <w:tr>
+        <w:tc>
+          <w:tcPr>
+            <w:tcW w:type="dxa" w:w="4680"/>
+            <w:vAlign w:val="center"/>
+          </w:tcPr>
+          <w:p>
+            <w:r/>
+            <w:r>
+              <w:rPr>
+                <w:b w:val="0"/>
+                <w:sz w:val="20"/>
+              </w:rPr>
+              <w:t>Database version</w:t>
+            </w:r>
+          </w:p>
+        </w:tc>
+        <w:tc>
+          <w:tcPr>
+            <w:tcW w:type="dxa" w:w="4680"/>
+            <w:vAlign w:val="center"/>
+          </w:tcPr>
+          <w:p>
+            <w:r/>
+            <w:r>
+              <w:rPr>
+                <w:b w:val="0"/>
+                <w:sz w:val="20"/>
+              </w:rPr>
+              <w:t>v7</w:t>
+            </w:r>
+          </w:p>
+        </w:tc>
+      </w:tr>
+      <w:tr>
+        <w:tc>
+          <w:tcPr>
+            <w:tcW w:type="dxa" w:w="4680"/>
+            <w:vAlign w:val="center"/>
+          </w:tcPr>
+          <w:p>
+            <w:r/>
+            <w:r>
+              <w:rPr>
+                <w:b w:val="0"/>
+                <w:sz w:val="20"/>
+              </w:rPr>
+              <w:t>Orchestrator local</w:t>
+            </w:r>
+          </w:p>
+        </w:tc>
+        <w:tc>
+          <w:tcPr>
+            <w:tcW w:type="dxa" w:w="4680"/>
+            <w:vAlign w:val="center"/>
+          </w:tcPr>
+          <w:p>
+            <w:r/>
+            <w:r>
+              <w:rPr>
+                <w:b w:val="0"/>
+                <w:sz w:val="20"/>
+              </w:rPr>
+              <w:t>src.jobs.sync.openalex_works</w:t>
+            </w:r>
+          </w:p>
+        </w:tc>
+      </w:tr>
+      <w:tr>
+        <w:tc>
+          <w:tcPr>
+            <w:tcW w:type="dxa" w:w="4680"/>
+            <w:vAlign w:val="center"/>
+          </w:tcPr>
+          <w:p>
+            <w:r/>
+            <w:r>
+              <w:rPr>
+                <w:b w:val="0"/>
+                <w:sz w:val="20"/>
+              </w:rPr>
+              <w:t>Airflow DAG</w:t>
+            </w:r>
+          </w:p>
+        </w:tc>
+        <w:tc>
+          <w:tcPr>
+            <w:tcW w:type="dxa" w:w="4680"/>
+            <w:vAlign w:val="center"/>
+          </w:tcPr>
+          <w:p>
+            <w:r/>
+            <w:r>
+              <w:rPr>
+                <w:b w:val="0"/>
+                <w:sz w:val="20"/>
+              </w:rPr>
+              <w:t>airflow/dags/openalex_works_sync_dag.py</w:t>
+            </w:r>
+          </w:p>
+        </w:tc>
+      </w:tr>
+      <w:tr>
+        <w:tc>
+          <w:tcPr>
+            <w:tcW w:type="dxa" w:w="4680"/>
+            <w:vAlign w:val="center"/>
+          </w:tcPr>
+          <w:p>
+            <w:r/>
+            <w:r>
+              <w:rPr>
+                <w:b w:val="0"/>
+                <w:sz w:val="20"/>
+              </w:rPr>
+              <w:t>Dữ liệu đầu ra</w:t>
+            </w:r>
+          </w:p>
+        </w:tc>
+        <w:tc>
+          <w:tcPr>
+            <w:tcW w:type="dxa" w:w="4680"/>
+            <w:vAlign w:val="center"/>
+          </w:tcPr>
+          <w:p>
+            <w:r/>
+            <w:r>
+              <w:rPr>
+                <w:b w:val="0"/>
+                <w:sz w:val="20"/>
+              </w:rPr>
+              <w:t>raw, core, ops schemas</w:t>
+            </w:r>
+          </w:p>
+        </w:tc>
+      </w:tr>
+    </w:tbl>
+    <w:p/>
     <w:p>
       <w:pPr>
         <w:pStyle w:val="Heading1"/>
       </w:pPr>
       <w:r>
-        <w:t>1. System Overview</w:t>
-      </w:r>
-    </w:p>
-    <w:p>
-      <w:r>
-        <w:t>The pipeline is organized as a data ingestion and normalization workflow. Backend services should read from core tables, while crawling and raw synchronization stay inside the data pipeline.</w:t>
+        <w:t>1. Tổng Quan Hệ Thống</w:t>
       </w:r>
     </w:p>
     <w:tbl>
@@ -68,18 +249,14 @@
       <w:tr>
         <w:tc>
           <w:tcPr>
-            <w:tcW w:type="dxa" w:w="1584"/>
+            <w:tcW w:type="dxa" w:w="3120"/>
+            <w:vAlign w:val="center"/>
             <w:shd w:fill="E8EEF5"/>
-            <w:vAlign w:val="center"/>
           </w:tcPr>
           <w:p>
-            <w:pPr>
-              <w:spacing w:after="0"/>
-            </w:pPr>
             <w:r/>
             <w:r>
               <w:rPr>
-                <w:rFonts w:ascii="Calibri" w:hAnsi="Calibri"/>
                 <w:b/>
                 <w:sz w:val="20"/>
               </w:rPr>
@@ -89,43 +266,35 @@
         </w:tc>
         <w:tc>
           <w:tcPr>
-            <w:tcW w:type="dxa" w:w="4464"/>
+            <w:tcW w:type="dxa" w:w="3120"/>
+            <w:vAlign w:val="center"/>
             <w:shd w:fill="E8EEF5"/>
-            <w:vAlign w:val="center"/>
           </w:tcPr>
           <w:p>
-            <w:pPr>
-              <w:spacing w:after="0"/>
-            </w:pPr>
             <w:r/>
             <w:r>
               <w:rPr>
-                <w:rFonts w:ascii="Calibri" w:hAnsi="Calibri"/>
                 <w:b/>
                 <w:sz w:val="20"/>
               </w:rPr>
-              <w:t>Purpose</w:t>
+              <w:t>Mục đích</w:t>
             </w:r>
           </w:p>
         </w:tc>
         <w:tc>
           <w:tcPr>
-            <w:tcW w:type="dxa" w:w="3312"/>
+            <w:tcW w:type="dxa" w:w="3120"/>
+            <w:vAlign w:val="center"/>
             <w:shd w:fill="E8EEF5"/>
-            <w:vAlign w:val="center"/>
           </w:tcPr>
           <w:p>
-            <w:pPr>
-              <w:spacing w:after="0"/>
-            </w:pPr>
             <w:r/>
             <w:r>
               <w:rPr>
-                <w:rFonts w:ascii="Calibri" w:hAnsi="Calibri"/>
                 <w:b/>
                 <w:sz w:val="20"/>
               </w:rPr>
-              <w:t>Main modules</w:t>
+              <w:t>Module chính</w:t>
             </w:r>
           </w:p>
         </w:tc>
@@ -133,17 +302,13 @@
       <w:tr>
         <w:tc>
           <w:tcPr>
-            <w:tcW w:type="dxa" w:w="1584"/>
+            <w:tcW w:type="dxa" w:w="3120"/>
             <w:vAlign w:val="center"/>
           </w:tcPr>
           <w:p>
-            <w:pPr>
-              <w:spacing w:after="0"/>
-            </w:pPr>
             <w:r/>
             <w:r>
               <w:rPr>
-                <w:rFonts w:ascii="Calibri" w:hAnsi="Calibri"/>
                 <w:b w:val="0"/>
                 <w:sz w:val="20"/>
               </w:rPr>
@@ -153,37 +318,29 @@
         </w:tc>
         <w:tc>
           <w:tcPr>
-            <w:tcW w:type="dxa" w:w="4464"/>
+            <w:tcW w:type="dxa" w:w="3120"/>
             <w:vAlign w:val="center"/>
           </w:tcPr>
           <w:p>
-            <w:pPr>
-              <w:spacing w:after="0"/>
-            </w:pPr>
             <w:r/>
             <w:r>
               <w:rPr>
-                <w:rFonts w:ascii="Calibri" w:hAnsi="Calibri"/>
                 <w:b w:val="0"/>
                 <w:sz w:val="20"/>
               </w:rPr>
-              <w:t>Call OpenAlex API and handle API params, retry, mailto, and api_key.</w:t>
+              <w:t>Gọi OpenAlex API, xử lý params, retry, mailto, api_key.</w:t>
             </w:r>
           </w:p>
         </w:tc>
         <w:tc>
           <w:tcPr>
-            <w:tcW w:type="dxa" w:w="3312"/>
+            <w:tcW w:type="dxa" w:w="3120"/>
             <w:vAlign w:val="center"/>
           </w:tcPr>
           <w:p>
-            <w:pPr>
-              <w:spacing w:after="0"/>
-            </w:pPr>
             <w:r/>
             <w:r>
               <w:rPr>
-                <w:rFonts w:ascii="Calibri" w:hAnsi="Calibri"/>
                 <w:b w:val="0"/>
                 <w:sz w:val="20"/>
               </w:rPr>
@@ -195,17 +352,13 @@
       <w:tr>
         <w:tc>
           <w:tcPr>
-            <w:tcW w:type="dxa" w:w="1584"/>
+            <w:tcW w:type="dxa" w:w="3120"/>
             <w:vAlign w:val="center"/>
           </w:tcPr>
           <w:p>
-            <w:pPr>
-              <w:spacing w:after="0"/>
-            </w:pPr>
             <w:r/>
             <w:r>
               <w:rPr>
-                <w:rFonts w:ascii="Calibri" w:hAnsi="Calibri"/>
                 <w:b w:val="0"/>
                 <w:sz w:val="20"/>
               </w:rPr>
@@ -215,37 +368,29 @@
         </w:tc>
         <w:tc>
           <w:tcPr>
-            <w:tcW w:type="dxa" w:w="4464"/>
+            <w:tcW w:type="dxa" w:w="3120"/>
             <w:vAlign w:val="center"/>
           </w:tcPr>
           <w:p>
-            <w:pPr>
-              <w:spacing w:after="0"/>
-            </w:pPr>
             <w:r/>
             <w:r>
               <w:rPr>
-                <w:rFonts w:ascii="Calibri" w:hAnsi="Calibri"/>
                 <w:b w:val="0"/>
                 <w:sz w:val="20"/>
               </w:rPr>
-              <w:t>Fetch works by keyword and store changed records into raw tables.</w:t>
+              <w:t>Fetch works theo keyword và lưu raw payload thay đổi.</w:t>
             </w:r>
           </w:p>
         </w:tc>
         <w:tc>
           <w:tcPr>
-            <w:tcW w:type="dxa" w:w="3312"/>
+            <w:tcW w:type="dxa" w:w="3120"/>
             <w:vAlign w:val="center"/>
           </w:tcPr>
           <w:p>
-            <w:pPr>
-              <w:spacing w:after="0"/>
-            </w:pPr>
             <w:r/>
             <w:r>
               <w:rPr>
-                <w:rFonts w:ascii="Calibri" w:hAnsi="Calibri"/>
                 <w:b w:val="0"/>
                 <w:sz w:val="20"/>
               </w:rPr>
@@ -257,17 +402,13 @@
       <w:tr>
         <w:tc>
           <w:tcPr>
-            <w:tcW w:type="dxa" w:w="1584"/>
+            <w:tcW w:type="dxa" w:w="3120"/>
             <w:vAlign w:val="center"/>
           </w:tcPr>
           <w:p>
-            <w:pPr>
-              <w:spacing w:after="0"/>
-            </w:pPr>
             <w:r/>
             <w:r>
               <w:rPr>
-                <w:rFonts w:ascii="Calibri" w:hAnsi="Calibri"/>
                 <w:b w:val="0"/>
                 <w:sz w:val="20"/>
               </w:rPr>
@@ -277,37 +418,29 @@
         </w:tc>
         <w:tc>
           <w:tcPr>
-            <w:tcW w:type="dxa" w:w="4464"/>
+            <w:tcW w:type="dxa" w:w="3120"/>
             <w:vAlign w:val="center"/>
           </w:tcPr>
           <w:p>
-            <w:pPr>
-              <w:spacing w:after="0"/>
-            </w:pPr>
             <w:r/>
             <w:r>
               <w:rPr>
-                <w:rFonts w:ascii="Calibri" w:hAnsi="Calibri"/>
                 <w:b w:val="0"/>
                 <w:sz w:val="20"/>
               </w:rPr>
-              <w:t>Transform pending raw records into core canonical tables.</w:t>
+              <w:t>Chuyển pending raw records vào core canonical tables.</w:t>
             </w:r>
           </w:p>
         </w:tc>
         <w:tc>
           <w:tcPr>
-            <w:tcW w:type="dxa" w:w="3312"/>
+            <w:tcW w:type="dxa" w:w="3120"/>
             <w:vAlign w:val="center"/>
           </w:tcPr>
           <w:p>
-            <w:pPr>
-              <w:spacing w:after="0"/>
-            </w:pPr>
             <w:r/>
             <w:r>
               <w:rPr>
-                <w:rFonts w:ascii="Calibri" w:hAnsi="Calibri"/>
                 <w:b w:val="0"/>
                 <w:sz w:val="20"/>
               </w:rPr>
@@ -319,17 +452,13 @@
       <w:tr>
         <w:tc>
           <w:tcPr>
-            <w:tcW w:type="dxa" w:w="1584"/>
+            <w:tcW w:type="dxa" w:w="3120"/>
             <w:vAlign w:val="center"/>
           </w:tcPr>
           <w:p>
-            <w:pPr>
-              <w:spacing w:after="0"/>
-            </w:pPr>
             <w:r/>
             <w:r>
               <w:rPr>
-                <w:rFonts w:ascii="Calibri" w:hAnsi="Calibri"/>
                 <w:b w:val="0"/>
                 <w:sz w:val="20"/>
               </w:rPr>
@@ -339,37 +468,29 @@
         </w:tc>
         <w:tc>
           <w:tcPr>
-            <w:tcW w:type="dxa" w:w="4464"/>
+            <w:tcW w:type="dxa" w:w="3120"/>
             <w:vAlign w:val="center"/>
           </w:tcPr>
           <w:p>
-            <w:pPr>
-              <w:spacing w:after="0"/>
-            </w:pPr>
             <w:r/>
             <w:r>
               <w:rPr>
-                <w:rFonts w:ascii="Calibri" w:hAnsi="Calibri"/>
                 <w:b w:val="0"/>
                 <w:sz w:val="20"/>
               </w:rPr>
-              <w:t>Fetch detail endpoints such as authors/{id} and sources/{id}.</w:t>
+              <w:t>Gọi detail endpoints authors/{id} và sources/{id}.</w:t>
             </w:r>
           </w:p>
         </w:tc>
         <w:tc>
           <w:tcPr>
-            <w:tcW w:type="dxa" w:w="3312"/>
+            <w:tcW w:type="dxa" w:w="3120"/>
             <w:vAlign w:val="center"/>
           </w:tcPr>
           <w:p>
-            <w:pPr>
-              <w:spacing w:after="0"/>
-            </w:pPr>
             <w:r/>
             <w:r>
               <w:rPr>
-                <w:rFonts w:ascii="Calibri" w:hAnsi="Calibri"/>
                 <w:b w:val="0"/>
                 <w:sz w:val="20"/>
               </w:rPr>
@@ -381,17 +502,13 @@
       <w:tr>
         <w:tc>
           <w:tcPr>
-            <w:tcW w:type="dxa" w:w="1584"/>
+            <w:tcW w:type="dxa" w:w="3120"/>
             <w:vAlign w:val="center"/>
           </w:tcPr>
           <w:p>
-            <w:pPr>
-              <w:spacing w:after="0"/>
-            </w:pPr>
             <w:r/>
             <w:r>
               <w:rPr>
-                <w:rFonts w:ascii="Calibri" w:hAnsi="Calibri"/>
                 <w:b w:val="0"/>
                 <w:sz w:val="20"/>
               </w:rPr>
@@ -401,37 +518,29 @@
         </w:tc>
         <w:tc>
           <w:tcPr>
-            <w:tcW w:type="dxa" w:w="4464"/>
+            <w:tcW w:type="dxa" w:w="3120"/>
             <w:vAlign w:val="center"/>
           </w:tcPr>
           <w:p>
-            <w:pPr>
-              <w:spacing w:after="0"/>
-            </w:pPr>
             <w:r/>
             <w:r>
               <w:rPr>
-                <w:rFonts w:ascii="Calibri" w:hAnsi="Calibri"/>
                 <w:b w:val="0"/>
                 <w:sz w:val="20"/>
               </w:rPr>
-              <w:t>Local orchestrator that runs ingest, process, and optional enrich jobs.</w:t>
+              <w:t>Orchestrator chạy ingest, process, và optional enrich.</w:t>
             </w:r>
           </w:p>
         </w:tc>
         <w:tc>
           <w:tcPr>
-            <w:tcW w:type="dxa" w:w="3312"/>
+            <w:tcW w:type="dxa" w:w="3120"/>
             <w:vAlign w:val="center"/>
           </w:tcPr>
           <w:p>
-            <w:pPr>
-              <w:spacing w:after="0"/>
-            </w:pPr>
             <w:r/>
             <w:r>
               <w:rPr>
-                <w:rFonts w:ascii="Calibri" w:hAnsi="Calibri"/>
                 <w:b w:val="0"/>
                 <w:sz w:val="20"/>
               </w:rPr>
@@ -443,17 +552,13 @@
       <w:tr>
         <w:tc>
           <w:tcPr>
-            <w:tcW w:type="dxa" w:w="1584"/>
+            <w:tcW w:type="dxa" w:w="3120"/>
             <w:vAlign w:val="center"/>
           </w:tcPr>
           <w:p>
-            <w:pPr>
-              <w:spacing w:after="0"/>
-            </w:pPr>
             <w:r/>
             <w:r>
               <w:rPr>
-                <w:rFonts w:ascii="Calibri" w:hAnsi="Calibri"/>
                 <w:b w:val="0"/>
                 <w:sz w:val="20"/>
               </w:rPr>
@@ -463,37 +568,29 @@
         </w:tc>
         <w:tc>
           <w:tcPr>
-            <w:tcW w:type="dxa" w:w="4464"/>
+            <w:tcW w:type="dxa" w:w="3120"/>
             <w:vAlign w:val="center"/>
           </w:tcPr>
           <w:p>
-            <w:pPr>
-              <w:spacing w:after="0"/>
-            </w:pPr>
             <w:r/>
             <w:r>
               <w:rPr>
-                <w:rFonts w:ascii="Calibri" w:hAnsi="Calibri"/>
                 <w:b w:val="0"/>
                 <w:sz w:val="20"/>
               </w:rPr>
-              <w:t>Operational job logs and crawl watermarks.</w:t>
+              <w:t>Job logs và crawl watermarks.</w:t>
             </w:r>
           </w:p>
         </w:tc>
         <w:tc>
           <w:tcPr>
-            <w:tcW w:type="dxa" w:w="3312"/>
+            <w:tcW w:type="dxa" w:w="3120"/>
             <w:vAlign w:val="center"/>
           </w:tcPr>
           <w:p>
-            <w:pPr>
-              <w:spacing w:after="0"/>
-            </w:pPr>
             <w:r/>
             <w:r>
               <w:rPr>
-                <w:rFonts w:ascii="Calibri" w:hAnsi="Calibri"/>
                 <w:b w:val="0"/>
                 <w:sz w:val="20"/>
               </w:rPr>
@@ -509,7 +606,7 @@
         <w:pStyle w:val="Heading1"/>
       </w:pPr>
       <w:r>
-        <w:t>2. Runtime Flow</w:t>
+        <w:t>2. Luồng Runtime</w:t>
       </w:r>
     </w:p>
     <w:p>
@@ -517,7 +614,7 @@
         <w:pStyle w:val="ListNumber"/>
       </w:pPr>
       <w:r>
-        <w:t>Select one or more keywords from CLI input or SEED_KEYWORDS.</w:t>
+        <w:t>Chọn một hoặc nhiều keywords từ CLI hoặc SEED_KEYWORDS.</w:t>
       </w:r>
     </w:p>
     <w:p>
@@ -525,7 +622,7 @@
         <w:pStyle w:val="ListNumber"/>
       </w:pPr>
       <w:r>
-        <w:t>Run OpenAlex works ingest for each keyword using cursor pagination and watermark state.</w:t>
+        <w:t>Chạy OpenAlex works ingest cho từng keyword bằng cursor pagination và watermark state.</w:t>
       </w:r>
     </w:p>
     <w:p>
@@ -533,7 +630,7 @@
         <w:pStyle w:val="ListNumber"/>
       </w:pPr>
       <w:r>
-        <w:t>Store new or changed payloads in raw.openalex_works.</w:t>
+        <w:t>Lưu payload mới hoặc thay đổi vào raw.openalex_works.</w:t>
       </w:r>
     </w:p>
     <w:p>
@@ -541,7 +638,7 @@
         <w:pStyle w:val="ListNumber"/>
       </w:pPr>
       <w:r>
-        <w:t>Process pending raw works into core.papers, core.authors, core.journals, keywords, and topics.</w:t>
+        <w:t>Process pending raw works vào core.papers, core.authors, core.journals, keywords, topics.</w:t>
       </w:r>
     </w:p>
     <w:p>
@@ -549,7 +646,7 @@
         <w:pStyle w:val="ListNumber"/>
       </w:pPr>
       <w:r>
-        <w:t>Optionally enrich authors and sources from OpenAlex detail endpoints.</w:t>
+        <w:t>Nếu bật enrich, fetch thêm detail authors và sources từ OpenAlex.</w:t>
       </w:r>
     </w:p>
     <w:p>
@@ -557,7 +654,15 @@
         <w:pStyle w:val="ListNumber"/>
       </w:pPr>
       <w:r>
-        <w:t>Record operational state in ops.job_runs, ops.job_logs, and ops.crawl_watermarks.</w:t>
+        <w:t>Ghi trạng thái vận hành vào ops.job_runs, ops.job_logs, và ops.crawl_watermarks.</w:t>
+      </w:r>
+    </w:p>
+    <w:p>
+      <w:pPr>
+        <w:pStyle w:val="Heading1"/>
+      </w:pPr>
+      <w:r>
+        <w:t>3. Các Command Chính</w:t>
       </w:r>
     </w:p>
     <w:tbl>
@@ -574,18 +679,14 @@
       <w:tr>
         <w:tc>
           <w:tcPr>
-            <w:tcW w:type="dxa" w:w="3168"/>
+            <w:tcW w:type="dxa" w:w="4680"/>
+            <w:vAlign w:val="center"/>
             <w:shd w:fill="E8EEF5"/>
-            <w:vAlign w:val="center"/>
           </w:tcPr>
           <w:p>
-            <w:pPr>
-              <w:spacing w:after="0"/>
-            </w:pPr>
             <w:r/>
             <w:r>
               <w:rPr>
-                <w:rFonts w:ascii="Calibri" w:hAnsi="Calibri"/>
                 <w:b/>
                 <w:sz w:val="20"/>
               </w:rPr>
@@ -595,22 +696,18 @@
         </w:tc>
         <w:tc>
           <w:tcPr>
-            <w:tcW w:type="dxa" w:w="6192"/>
+            <w:tcW w:type="dxa" w:w="4680"/>
+            <w:vAlign w:val="center"/>
             <w:shd w:fill="E8EEF5"/>
-            <w:vAlign w:val="center"/>
           </w:tcPr>
           <w:p>
-            <w:pPr>
-              <w:spacing w:after="0"/>
-            </w:pPr>
             <w:r/>
             <w:r>
               <w:rPr>
-                <w:rFonts w:ascii="Calibri" w:hAnsi="Calibri"/>
                 <w:b/>
                 <w:sz w:val="20"/>
               </w:rPr>
-              <w:t>Meaning</w:t>
+              <w:t>Ý nghĩa</w:t>
             </w:r>
           </w:p>
         </w:tc>
@@ -618,41 +715,33 @@
       <w:tr>
         <w:tc>
           <w:tcPr>
-            <w:tcW w:type="dxa" w:w="3168"/>
+            <w:tcW w:type="dxa" w:w="4680"/>
             <w:vAlign w:val="center"/>
           </w:tcPr>
           <w:p>
-            <w:pPr>
-              <w:spacing w:after="0"/>
-            </w:pPr>
             <w:r/>
             <w:r>
               <w:rPr>
-                <w:rFonts w:ascii="Calibri" w:hAnsi="Calibri"/>
                 <w:b w:val="0"/>
                 <w:sz w:val="20"/>
               </w:rPr>
-              <w:t>sync.openalex_works</w:t>
+              <w:t>python -m src.jobs.sync.openalex_works</w:t>
             </w:r>
           </w:p>
         </w:tc>
         <w:tc>
           <w:tcPr>
-            <w:tcW w:type="dxa" w:w="6192"/>
+            <w:tcW w:type="dxa" w:w="4680"/>
             <w:vAlign w:val="center"/>
           </w:tcPr>
           <w:p>
-            <w:pPr>
-              <w:spacing w:after="0"/>
-            </w:pPr>
             <w:r/>
             <w:r>
               <w:rPr>
-                <w:rFonts w:ascii="Calibri" w:hAnsi="Calibri"/>
                 <w:b w:val="0"/>
                 <w:sz w:val="20"/>
               </w:rPr>
-              <w:t>Recommended local orchestrator for works sync.</w:t>
+              <w:t>Orchestrator khuyến nghị cho works sync.</w:t>
             </w:r>
           </w:p>
         </w:tc>
@@ -660,41 +749,33 @@
       <w:tr>
         <w:tc>
           <w:tcPr>
-            <w:tcW w:type="dxa" w:w="3168"/>
+            <w:tcW w:type="dxa" w:w="4680"/>
             <w:vAlign w:val="center"/>
           </w:tcPr>
           <w:p>
-            <w:pPr>
-              <w:spacing w:after="0"/>
-            </w:pPr>
             <w:r/>
             <w:r>
               <w:rPr>
-                <w:rFonts w:ascii="Calibri" w:hAnsi="Calibri"/>
                 <w:b w:val="0"/>
                 <w:sz w:val="20"/>
               </w:rPr>
-              <w:t>ingest.openalex_works</w:t>
+              <w:t>python -m src.jobs.ingest.openalex_works</w:t>
             </w:r>
           </w:p>
         </w:tc>
         <w:tc>
           <w:tcPr>
-            <w:tcW w:type="dxa" w:w="6192"/>
+            <w:tcW w:type="dxa" w:w="4680"/>
             <w:vAlign w:val="center"/>
           </w:tcPr>
           <w:p>
-            <w:pPr>
-              <w:spacing w:after="0"/>
-            </w:pPr>
             <w:r/>
             <w:r>
               <w:rPr>
-                <w:rFonts w:ascii="Calibri" w:hAnsi="Calibri"/>
                 <w:b w:val="0"/>
                 <w:sz w:val="20"/>
               </w:rPr>
-              <w:t>Lower-level single-keyword ingest command.</w:t>
+              <w:t>Ingest thấp hơn cho một keyword.</w:t>
             </w:r>
           </w:p>
         </w:tc>
@@ -702,41 +783,33 @@
       <w:tr>
         <w:tc>
           <w:tcPr>
-            <w:tcW w:type="dxa" w:w="3168"/>
+            <w:tcW w:type="dxa" w:w="4680"/>
             <w:vAlign w:val="center"/>
           </w:tcPr>
           <w:p>
-            <w:pPr>
-              <w:spacing w:after="0"/>
-            </w:pPr>
             <w:r/>
             <w:r>
               <w:rPr>
-                <w:rFonts w:ascii="Calibri" w:hAnsi="Calibri"/>
                 <w:b w:val="0"/>
                 <w:sz w:val="20"/>
               </w:rPr>
-              <w:t>process.raw_works</w:t>
+              <w:t>python -m src.jobs.process.raw_works</w:t>
             </w:r>
           </w:p>
         </w:tc>
         <w:tc>
           <w:tcPr>
-            <w:tcW w:type="dxa" w:w="6192"/>
+            <w:tcW w:type="dxa" w:w="4680"/>
             <w:vAlign w:val="center"/>
           </w:tcPr>
           <w:p>
-            <w:pPr>
-              <w:spacing w:after="0"/>
-            </w:pPr>
             <w:r/>
             <w:r>
               <w:rPr>
-                <w:rFonts w:ascii="Calibri" w:hAnsi="Calibri"/>
                 <w:b w:val="0"/>
                 <w:sz w:val="20"/>
               </w:rPr>
-              <w:t>Process existing pending raw works only.</w:t>
+              <w:t>Process pending raw works hiện có.</w:t>
             </w:r>
           </w:p>
         </w:tc>
@@ -744,41 +817,33 @@
       <w:tr>
         <w:tc>
           <w:tcPr>
-            <w:tcW w:type="dxa" w:w="3168"/>
+            <w:tcW w:type="dxa" w:w="4680"/>
             <w:vAlign w:val="center"/>
           </w:tcPr>
           <w:p>
-            <w:pPr>
-              <w:spacing w:after="0"/>
-            </w:pPr>
             <w:r/>
             <w:r>
               <w:rPr>
-                <w:rFonts w:ascii="Calibri" w:hAnsi="Calibri"/>
                 <w:b w:val="0"/>
                 <w:sz w:val="20"/>
               </w:rPr>
-              <w:t>enrich.openalex_authors</w:t>
+              <w:t>python -m src.jobs.enrich.openalex_authors</w:t>
             </w:r>
           </w:p>
         </w:tc>
         <w:tc>
           <w:tcPr>
-            <w:tcW w:type="dxa" w:w="6192"/>
+            <w:tcW w:type="dxa" w:w="4680"/>
             <w:vAlign w:val="center"/>
           </w:tcPr>
           <w:p>
-            <w:pPr>
-              <w:spacing w:after="0"/>
-            </w:pPr>
             <w:r/>
             <w:r>
               <w:rPr>
-                <w:rFonts w:ascii="Calibri" w:hAnsi="Calibri"/>
                 <w:b w:val="0"/>
                 <w:sz w:val="20"/>
               </w:rPr>
-              <w:t>Fetch and process author detail data.</w:t>
+              <w:t>Fetch và process author detail.</w:t>
             </w:r>
           </w:p>
         </w:tc>
@@ -786,41 +851,33 @@
       <w:tr>
         <w:tc>
           <w:tcPr>
-            <w:tcW w:type="dxa" w:w="3168"/>
+            <w:tcW w:type="dxa" w:w="4680"/>
             <w:vAlign w:val="center"/>
           </w:tcPr>
           <w:p>
-            <w:pPr>
-              <w:spacing w:after="0"/>
-            </w:pPr>
             <w:r/>
             <w:r>
               <w:rPr>
-                <w:rFonts w:ascii="Calibri" w:hAnsi="Calibri"/>
                 <w:b w:val="0"/>
                 <w:sz w:val="20"/>
               </w:rPr>
-              <w:t>enrich.openalex_sources</w:t>
+              <w:t>python -m src.jobs.enrich.openalex_sources</w:t>
             </w:r>
           </w:p>
         </w:tc>
         <w:tc>
           <w:tcPr>
-            <w:tcW w:type="dxa" w:w="6192"/>
+            <w:tcW w:type="dxa" w:w="4680"/>
             <w:vAlign w:val="center"/>
           </w:tcPr>
           <w:p>
-            <w:pPr>
-              <w:spacing w:after="0"/>
-            </w:pPr>
             <w:r/>
             <w:r>
               <w:rPr>
-                <w:rFonts w:ascii="Calibri" w:hAnsi="Calibri"/>
                 <w:b w:val="0"/>
                 <w:sz w:val="20"/>
               </w:rPr>
-              <w:t>Fetch and process source/journal detail data.</w:t>
+              <w:t>Fetch và process source/journal detail.</w:t>
             </w:r>
           </w:p>
         </w:tc>
@@ -832,12 +889,7 @@
         <w:pStyle w:val="Heading1"/>
       </w:pPr>
       <w:r>
-        <w:t>3. Crawl Modes</w:t>
-      </w:r>
-    </w:p>
-    <w:p>
-      <w:r>
-        <w:t>Crawl mode is stored in job and watermark metadata as JSON. It is not a dedicated database column yet.</w:t>
+        <w:t>4. Crawl Modes</w:t>
       </w:r>
     </w:p>
     <w:tbl>
@@ -855,18 +907,14 @@
       <w:tr>
         <w:tc>
           <w:tcPr>
-            <w:tcW w:type="dxa" w:w="1728"/>
+            <w:tcW w:type="dxa" w:w="3120"/>
+            <w:vAlign w:val="center"/>
             <w:shd w:fill="E8EEF5"/>
-            <w:vAlign w:val="center"/>
           </w:tcPr>
           <w:p>
-            <w:pPr>
-              <w:spacing w:after="0"/>
-            </w:pPr>
             <w:r/>
             <w:r>
               <w:rPr>
-                <w:rFonts w:ascii="Calibri" w:hAnsi="Calibri"/>
                 <w:b/>
                 <w:sz w:val="20"/>
               </w:rPr>
@@ -876,43 +924,35 @@
         </w:tc>
         <w:tc>
           <w:tcPr>
-            <w:tcW w:type="dxa" w:w="4032"/>
+            <w:tcW w:type="dxa" w:w="3120"/>
+            <w:vAlign w:val="center"/>
             <w:shd w:fill="E8EEF5"/>
-            <w:vAlign w:val="center"/>
           </w:tcPr>
           <w:p>
-            <w:pPr>
-              <w:spacing w:after="0"/>
-            </w:pPr>
             <w:r/>
             <w:r>
               <w:rPr>
-                <w:rFonts w:ascii="Calibri" w:hAnsi="Calibri"/>
                 <w:b/>
                 <w:sz w:val="20"/>
               </w:rPr>
-              <w:t>When it happens</w:t>
+              <w:t>Khi nào xảy ra</w:t>
             </w:r>
           </w:p>
         </w:tc>
         <w:tc>
           <w:tcPr>
-            <w:tcW w:type="dxa" w:w="3600"/>
+            <w:tcW w:type="dxa" w:w="3120"/>
+            <w:vAlign w:val="center"/>
             <w:shd w:fill="E8EEF5"/>
-            <w:vAlign w:val="center"/>
           </w:tcPr>
           <w:p>
-            <w:pPr>
-              <w:spacing w:after="0"/>
-            </w:pPr>
             <w:r/>
             <w:r>
               <w:rPr>
-                <w:rFonts w:ascii="Calibri" w:hAnsi="Calibri"/>
                 <w:b/>
                 <w:sz w:val="20"/>
               </w:rPr>
-              <w:t>API filter behavior</w:t>
+              <w:t>Hành vi API filter</w:t>
             </w:r>
           </w:p>
         </w:tc>
@@ -920,17 +960,13 @@
       <w:tr>
         <w:tc>
           <w:tcPr>
-            <w:tcW w:type="dxa" w:w="1728"/>
+            <w:tcW w:type="dxa" w:w="3120"/>
             <w:vAlign w:val="center"/>
           </w:tcPr>
           <w:p>
-            <w:pPr>
-              <w:spacing w:after="0"/>
-            </w:pPr>
             <w:r/>
             <w:r>
               <w:rPr>
-                <w:rFonts w:ascii="Calibri" w:hAnsi="Calibri"/>
                 <w:b w:val="0"/>
                 <w:sz w:val="20"/>
               </w:rPr>
@@ -940,41 +976,33 @@
         </w:tc>
         <w:tc>
           <w:tcPr>
-            <w:tcW w:type="dxa" w:w="4032"/>
+            <w:tcW w:type="dxa" w:w="3120"/>
             <w:vAlign w:val="center"/>
           </w:tcPr>
           <w:p>
-            <w:pPr>
-              <w:spacing w:after="0"/>
-            </w:pPr>
             <w:r/>
             <w:r>
               <w:rPr>
-                <w:rFonts w:ascii="Calibri" w:hAnsi="Calibri"/>
                 <w:b w:val="0"/>
                 <w:sz w:val="20"/>
               </w:rPr>
-              <w:t>No watermark exists for the keyword.</w:t>
+              <w:t>Chưa có watermark cho keyword.</w:t>
             </w:r>
           </w:p>
         </w:tc>
         <w:tc>
           <w:tcPr>
-            <w:tcW w:type="dxa" w:w="3600"/>
+            <w:tcW w:type="dxa" w:w="3120"/>
             <w:vAlign w:val="center"/>
           </w:tcPr>
           <w:p>
-            <w:pPr>
-              <w:spacing w:after="0"/>
-            </w:pPr>
             <w:r/>
             <w:r>
               <w:rPr>
-                <w:rFonts w:ascii="Calibri" w:hAnsi="Calibri"/>
                 <w:b w:val="0"/>
                 <w:sz w:val="20"/>
               </w:rPr>
-              <w:t>Crawl keyword normally. Do not send updated-date filter.</w:t>
+              <w:t>Crawl keyword bình thường, không gửi updated-date filter.</w:t>
             </w:r>
           </w:p>
         </w:tc>
@@ -982,17 +1010,13 @@
       <w:tr>
         <w:tc>
           <w:tcPr>
-            <w:tcW w:type="dxa" w:w="1728"/>
+            <w:tcW w:type="dxa" w:w="3120"/>
             <w:vAlign w:val="center"/>
           </w:tcPr>
           <w:p>
-            <w:pPr>
-              <w:spacing w:after="0"/>
-            </w:pPr>
             <w:r/>
             <w:r>
               <w:rPr>
-                <w:rFonts w:ascii="Calibri" w:hAnsi="Calibri"/>
                 <w:b w:val="0"/>
                 <w:sz w:val="20"/>
               </w:rPr>
@@ -1002,41 +1026,33 @@
         </w:tc>
         <w:tc>
           <w:tcPr>
-            <w:tcW w:type="dxa" w:w="4032"/>
+            <w:tcW w:type="dxa" w:w="3120"/>
             <w:vAlign w:val="center"/>
           </w:tcPr>
           <w:p>
-            <w:pPr>
-              <w:spacing w:after="0"/>
-            </w:pPr>
             <w:r/>
             <w:r>
               <w:rPr>
-                <w:rFonts w:ascii="Calibri" w:hAnsi="Calibri"/>
                 <w:b w:val="0"/>
                 <w:sz w:val="20"/>
               </w:rPr>
-              <w:t>last_to_updated_date exists and last_cursor is empty.</w:t>
+              <w:t>Đã có last_to_updated_date và không còn last_cursor.</w:t>
             </w:r>
           </w:p>
         </w:tc>
         <w:tc>
           <w:tcPr>
-            <w:tcW w:type="dxa" w:w="3600"/>
+            <w:tcW w:type="dxa" w:w="3120"/>
             <w:vAlign w:val="center"/>
           </w:tcPr>
           <w:p>
-            <w:pPr>
-              <w:spacing w:after="0"/>
-            </w:pPr>
             <w:r/>
             <w:r>
               <w:rPr>
-                <w:rFonts w:ascii="Calibri" w:hAnsi="Calibri"/>
                 <w:b w:val="0"/>
                 <w:sz w:val="20"/>
               </w:rPr>
-              <w:t>Send from_updated_date and to_updated_date.</w:t>
+              <w:t>Gửi from_updated_date và to_updated_date.</w:t>
             </w:r>
           </w:p>
         </w:tc>
@@ -1044,17 +1060,13 @@
       <w:tr>
         <w:tc>
           <w:tcPr>
-            <w:tcW w:type="dxa" w:w="1728"/>
+            <w:tcW w:type="dxa" w:w="3120"/>
             <w:vAlign w:val="center"/>
           </w:tcPr>
           <w:p>
-            <w:pPr>
-              <w:spacing w:after="0"/>
-            </w:pPr>
             <w:r/>
             <w:r>
               <w:rPr>
-                <w:rFonts w:ascii="Calibri" w:hAnsi="Calibri"/>
                 <w:b w:val="0"/>
                 <w:sz w:val="20"/>
               </w:rPr>
@@ -1064,772 +1076,33 @@
         </w:tc>
         <w:tc>
           <w:tcPr>
-            <w:tcW w:type="dxa" w:w="4032"/>
+            <w:tcW w:type="dxa" w:w="3120"/>
             <w:vAlign w:val="center"/>
           </w:tcPr>
           <w:p>
-            <w:pPr>
-              <w:spacing w:after="0"/>
-            </w:pPr>
             <w:r/>
             <w:r>
               <w:rPr>
-                <w:rFonts w:ascii="Calibri" w:hAnsi="Calibri"/>
                 <w:b w:val="0"/>
                 <w:sz w:val="20"/>
               </w:rPr>
-              <w:t>last_cursor exists from a previous interrupted or max-pages-limited run.</w:t>
+              <w:t>Có last_cursor từ run bị dừng hoặc bị giới hạn max-pages.</w:t>
             </w:r>
           </w:p>
         </w:tc>
         <w:tc>
           <w:tcPr>
-            <w:tcW w:type="dxa" w:w="3600"/>
+            <w:tcW w:type="dxa" w:w="3120"/>
             <w:vAlign w:val="center"/>
           </w:tcPr>
           <w:p>
-            <w:pPr>
-              <w:spacing w:after="0"/>
-            </w:pPr>
             <w:r/>
             <w:r>
               <w:rPr>
-                <w:rFonts w:ascii="Calibri" w:hAnsi="Calibri"/>
                 <w:b w:val="0"/>
                 <w:sz w:val="20"/>
               </w:rPr>
-              <w:t>Continue the old cursor window. If this is initial resume, do not send updated-date filter.</w:t>
-            </w:r>
-          </w:p>
-        </w:tc>
-      </w:tr>
-    </w:tbl>
-    <w:p/>
-    <w:p>
-      <w:pPr>
-        <w:pStyle w:val="Callout"/>
-      </w:pPr>
-      <w:r>
-        <w:rPr>
-          <w:b/>
-        </w:rPr>
-        <w:t xml:space="preserve">Important: </w:t>
-      </w:r>
-      <w:r>
-        <w:t>Manual runs should use small max-pages values. Large initial backfills should be delegated to the sync orchestrator or Airflow later.</w:t>
-      </w:r>
-    </w:p>
-    <w:p>
-      <w:pPr>
-        <w:pStyle w:val="Heading1"/>
-      </w:pPr>
-      <w:r>
-        <w:t>4. Commands</w:t>
-      </w:r>
-    </w:p>
-    <w:p>
-      <w:pPr>
-        <w:pStyle w:val="Heading2"/>
-      </w:pPr>
-      <w:r>
-        <w:t>4.1 Recommended Sync Command</w:t>
-      </w:r>
-    </w:p>
-    <w:p>
-      <w:pPr>
-        <w:pStyle w:val="CodeBlock"/>
-      </w:pPr>
-      <w:r>
-        <w:t>python -m src.jobs.sync.openalex_works --keywords "machine learning" --per-page 25 --max-pages-per-keyword 1</w:t>
-      </w:r>
-    </w:p>
-    <w:p>
-      <w:pPr>
-        <w:pStyle w:val="Heading2"/>
-      </w:pPr>
-      <w:r>
-        <w:t>4.2 Sync with Enrichment</w:t>
-      </w:r>
-    </w:p>
-    <w:p>
-      <w:pPr>
-        <w:pStyle w:val="CodeBlock"/>
-      </w:pPr>
-      <w:r>
-        <w:t>python -m src.jobs.sync.openalex_works --keywords "machine learning" --per-page 25 --max-pages-per-keyword 1 --enrich-authors --enrich-sources --enrich-limit 100</w:t>
-      </w:r>
-    </w:p>
-    <w:p>
-      <w:pPr>
-        <w:pStyle w:val="Heading2"/>
-      </w:pPr>
-      <w:r>
-        <w:t>4.3 Ingest Only</w:t>
-      </w:r>
-    </w:p>
-    <w:p>
-      <w:pPr>
-        <w:pStyle w:val="CodeBlock"/>
-      </w:pPr>
-      <w:r>
-        <w:t>python -m src.jobs.ingest.openalex_works --keyword "machine learning" --per-page 25 --max-pages 1</w:t>
-      </w:r>
-    </w:p>
-    <w:p>
-      <w:pPr>
-        <w:pStyle w:val="Heading2"/>
-      </w:pPr>
-      <w:r>
-        <w:t>4.4 Ingest and Process One Keyword</w:t>
-      </w:r>
-    </w:p>
-    <w:p>
-      <w:pPr>
-        <w:pStyle w:val="CodeBlock"/>
-      </w:pPr>
-      <w:r>
-        <w:t>python -m src.jobs.ingest.openalex_works --keyword "machine learning" --per-page 25 --max-pages 1 --process</w:t>
-      </w:r>
-    </w:p>
-    <w:p>
-      <w:pPr>
-        <w:pStyle w:val="Heading2"/>
-      </w:pPr>
-      <w:r>
-        <w:t>4.5 CLI Options</w:t>
-      </w:r>
-    </w:p>
-    <w:tbl>
-      <w:tblPr>
-        <w:tblStyle w:val="TableGrid"/>
-        <w:tblW w:type="auto" w:w="0"/>
-        <w:jc w:val="center"/>
-        <w:tblLook w:firstColumn="1" w:firstRow="1" w:lastColumn="0" w:lastRow="0" w:noHBand="0" w:noVBand="1" w:val="04A0"/>
-      </w:tblPr>
-      <w:tblGrid>
-        <w:gridCol w:w="3120"/>
-        <w:gridCol w:w="3120"/>
-        <w:gridCol w:w="3120"/>
-      </w:tblGrid>
-      <w:tr>
-        <w:tc>
-          <w:tcPr>
-            <w:tcW w:type="dxa" w:w="2448"/>
-            <w:shd w:fill="E8EEF5"/>
-            <w:vAlign w:val="center"/>
-          </w:tcPr>
-          <w:p>
-            <w:pPr>
-              <w:spacing w:after="0"/>
-            </w:pPr>
-            <w:r/>
-            <w:r>
-              <w:rPr>
-                <w:rFonts w:ascii="Calibri" w:hAnsi="Calibri"/>
-                <w:b/>
-                <w:sz w:val="20"/>
-              </w:rPr>
-              <w:t>Option</w:t>
-            </w:r>
-          </w:p>
-        </w:tc>
-        <w:tc>
-          <w:tcPr>
-            <w:tcW w:type="dxa" w:w="1584"/>
-            <w:shd w:fill="E8EEF5"/>
-            <w:vAlign w:val="center"/>
-          </w:tcPr>
-          <w:p>
-            <w:pPr>
-              <w:spacing w:after="0"/>
-            </w:pPr>
-            <w:r/>
-            <w:r>
-              <w:rPr>
-                <w:rFonts w:ascii="Calibri" w:hAnsi="Calibri"/>
-                <w:b/>
-                <w:sz w:val="20"/>
-              </w:rPr>
-              <w:t>Used by</w:t>
-            </w:r>
-          </w:p>
-        </w:tc>
-        <w:tc>
-          <w:tcPr>
-            <w:tcW w:type="dxa" w:w="5328"/>
-            <w:shd w:fill="E8EEF5"/>
-            <w:vAlign w:val="center"/>
-          </w:tcPr>
-          <w:p>
-            <w:pPr>
-              <w:spacing w:after="0"/>
-            </w:pPr>
-            <w:r/>
-            <w:r>
-              <w:rPr>
-                <w:rFonts w:ascii="Calibri" w:hAnsi="Calibri"/>
-                <w:b/>
-                <w:sz w:val="20"/>
-              </w:rPr>
-              <w:t>Purpose</w:t>
-            </w:r>
-          </w:p>
-        </w:tc>
-      </w:tr>
-      <w:tr>
-        <w:tc>
-          <w:tcPr>
-            <w:tcW w:type="dxa" w:w="2448"/>
-            <w:vAlign w:val="center"/>
-          </w:tcPr>
-          <w:p>
-            <w:pPr>
-              <w:spacing w:after="0"/>
-            </w:pPr>
-            <w:r/>
-            <w:r>
-              <w:rPr>
-                <w:rFonts w:ascii="Calibri" w:hAnsi="Calibri"/>
-                <w:b w:val="0"/>
-                <w:sz w:val="20"/>
-              </w:rPr>
-              <w:t>--keywords</w:t>
-            </w:r>
-          </w:p>
-        </w:tc>
-        <w:tc>
-          <w:tcPr>
-            <w:tcW w:type="dxa" w:w="1584"/>
-            <w:vAlign w:val="center"/>
-          </w:tcPr>
-          <w:p>
-            <w:pPr>
-              <w:spacing w:after="0"/>
-            </w:pPr>
-            <w:r/>
-            <w:r>
-              <w:rPr>
-                <w:rFonts w:ascii="Calibri" w:hAnsi="Calibri"/>
-                <w:b w:val="0"/>
-                <w:sz w:val="20"/>
-              </w:rPr>
-              <w:t>sync</w:t>
-            </w:r>
-          </w:p>
-        </w:tc>
-        <w:tc>
-          <w:tcPr>
-            <w:tcW w:type="dxa" w:w="5328"/>
-            <w:vAlign w:val="center"/>
-          </w:tcPr>
-          <w:p>
-            <w:pPr>
-              <w:spacing w:after="0"/>
-            </w:pPr>
-            <w:r/>
-            <w:r>
-              <w:rPr>
-                <w:rFonts w:ascii="Calibri" w:hAnsi="Calibri"/>
-                <w:b w:val="0"/>
-                <w:sz w:val="20"/>
-              </w:rPr>
-              <w:t>One or more keywords. If omitted, use SEED_KEYWORDS.</w:t>
-            </w:r>
-          </w:p>
-        </w:tc>
-      </w:tr>
-      <w:tr>
-        <w:tc>
-          <w:tcPr>
-            <w:tcW w:type="dxa" w:w="2448"/>
-            <w:vAlign w:val="center"/>
-          </w:tcPr>
-          <w:p>
-            <w:pPr>
-              <w:spacing w:after="0"/>
-            </w:pPr>
-            <w:r/>
-            <w:r>
-              <w:rPr>
-                <w:rFonts w:ascii="Calibri" w:hAnsi="Calibri"/>
-                <w:b w:val="0"/>
-                <w:sz w:val="20"/>
-              </w:rPr>
-              <w:t>--keyword</w:t>
-            </w:r>
-          </w:p>
-        </w:tc>
-        <w:tc>
-          <w:tcPr>
-            <w:tcW w:type="dxa" w:w="1584"/>
-            <w:vAlign w:val="center"/>
-          </w:tcPr>
-          <w:p>
-            <w:pPr>
-              <w:spacing w:after="0"/>
-            </w:pPr>
-            <w:r/>
-            <w:r>
-              <w:rPr>
-                <w:rFonts w:ascii="Calibri" w:hAnsi="Calibri"/>
-                <w:b w:val="0"/>
-                <w:sz w:val="20"/>
-              </w:rPr>
-              <w:t>ingest</w:t>
-            </w:r>
-          </w:p>
-        </w:tc>
-        <w:tc>
-          <w:tcPr>
-            <w:tcW w:type="dxa" w:w="5328"/>
-            <w:vAlign w:val="center"/>
-          </w:tcPr>
-          <w:p>
-            <w:pPr>
-              <w:spacing w:after="0"/>
-            </w:pPr>
-            <w:r/>
-            <w:r>
-              <w:rPr>
-                <w:rFonts w:ascii="Calibri" w:hAnsi="Calibri"/>
-                <w:b w:val="0"/>
-                <w:sz w:val="20"/>
-              </w:rPr>
-              <w:t>Single keyword for lower-level ingest.</w:t>
-            </w:r>
-          </w:p>
-        </w:tc>
-      </w:tr>
-      <w:tr>
-        <w:tc>
-          <w:tcPr>
-            <w:tcW w:type="dxa" w:w="2448"/>
-            <w:vAlign w:val="center"/>
-          </w:tcPr>
-          <w:p>
-            <w:pPr>
-              <w:spacing w:after="0"/>
-            </w:pPr>
-            <w:r/>
-            <w:r>
-              <w:rPr>
-                <w:rFonts w:ascii="Calibri" w:hAnsi="Calibri"/>
-                <w:b w:val="0"/>
-                <w:sz w:val="20"/>
-              </w:rPr>
-              <w:t>--per-page</w:t>
-            </w:r>
-          </w:p>
-        </w:tc>
-        <w:tc>
-          <w:tcPr>
-            <w:tcW w:type="dxa" w:w="1584"/>
-            <w:vAlign w:val="center"/>
-          </w:tcPr>
-          <w:p>
-            <w:pPr>
-              <w:spacing w:after="0"/>
-            </w:pPr>
-            <w:r/>
-            <w:r>
-              <w:rPr>
-                <w:rFonts w:ascii="Calibri" w:hAnsi="Calibri"/>
-                <w:b w:val="0"/>
-                <w:sz w:val="20"/>
-              </w:rPr>
-              <w:t>sync/ingest</w:t>
-            </w:r>
-          </w:p>
-        </w:tc>
-        <w:tc>
-          <w:tcPr>
-            <w:tcW w:type="dxa" w:w="5328"/>
-            <w:vAlign w:val="center"/>
-          </w:tcPr>
-          <w:p>
-            <w:pPr>
-              <w:spacing w:after="0"/>
-            </w:pPr>
-            <w:r/>
-            <w:r>
-              <w:rPr>
-                <w:rFonts w:ascii="Calibri" w:hAnsi="Calibri"/>
-                <w:b w:val="0"/>
-                <w:sz w:val="20"/>
-              </w:rPr>
-              <w:t>OpenAlex records per cursor page.</w:t>
-            </w:r>
-          </w:p>
-        </w:tc>
-      </w:tr>
-      <w:tr>
-        <w:tc>
-          <w:tcPr>
-            <w:tcW w:type="dxa" w:w="2448"/>
-            <w:vAlign w:val="center"/>
-          </w:tcPr>
-          <w:p>
-            <w:pPr>
-              <w:spacing w:after="0"/>
-            </w:pPr>
-            <w:r/>
-            <w:r>
-              <w:rPr>
-                <w:rFonts w:ascii="Calibri" w:hAnsi="Calibri"/>
-                <w:b w:val="0"/>
-                <w:sz w:val="20"/>
-              </w:rPr>
-              <w:t>--max-pages-per-keyword</w:t>
-            </w:r>
-          </w:p>
-        </w:tc>
-        <w:tc>
-          <w:tcPr>
-            <w:tcW w:type="dxa" w:w="1584"/>
-            <w:vAlign w:val="center"/>
-          </w:tcPr>
-          <w:p>
-            <w:pPr>
-              <w:spacing w:after="0"/>
-            </w:pPr>
-            <w:r/>
-            <w:r>
-              <w:rPr>
-                <w:rFonts w:ascii="Calibri" w:hAnsi="Calibri"/>
-                <w:b w:val="0"/>
-                <w:sz w:val="20"/>
-              </w:rPr>
-              <w:t>sync</w:t>
-            </w:r>
-          </w:p>
-        </w:tc>
-        <w:tc>
-          <w:tcPr>
-            <w:tcW w:type="dxa" w:w="5328"/>
-            <w:vAlign w:val="center"/>
-          </w:tcPr>
-          <w:p>
-            <w:pPr>
-              <w:spacing w:after="0"/>
-            </w:pPr>
-            <w:r/>
-            <w:r>
-              <w:rPr>
-                <w:rFonts w:ascii="Calibri" w:hAnsi="Calibri"/>
-                <w:b w:val="0"/>
-                <w:sz w:val="20"/>
-              </w:rPr>
-              <w:t>Maximum pages per keyword. Use all/none/full to crawl the full window.</w:t>
-            </w:r>
-          </w:p>
-        </w:tc>
-      </w:tr>
-      <w:tr>
-        <w:tc>
-          <w:tcPr>
-            <w:tcW w:type="dxa" w:w="2448"/>
-            <w:vAlign w:val="center"/>
-          </w:tcPr>
-          <w:p>
-            <w:pPr>
-              <w:spacing w:after="0"/>
-            </w:pPr>
-            <w:r/>
-            <w:r>
-              <w:rPr>
-                <w:rFonts w:ascii="Calibri" w:hAnsi="Calibri"/>
-                <w:b w:val="0"/>
-                <w:sz w:val="20"/>
-              </w:rPr>
-              <w:t>--max-pages</w:t>
-            </w:r>
-          </w:p>
-        </w:tc>
-        <w:tc>
-          <w:tcPr>
-            <w:tcW w:type="dxa" w:w="1584"/>
-            <w:vAlign w:val="center"/>
-          </w:tcPr>
-          <w:p>
-            <w:pPr>
-              <w:spacing w:after="0"/>
-            </w:pPr>
-            <w:r/>
-            <w:r>
-              <w:rPr>
-                <w:rFonts w:ascii="Calibri" w:hAnsi="Calibri"/>
-                <w:b w:val="0"/>
-                <w:sz w:val="20"/>
-              </w:rPr>
-              <w:t>ingest</w:t>
-            </w:r>
-          </w:p>
-        </w:tc>
-        <w:tc>
-          <w:tcPr>
-            <w:tcW w:type="dxa" w:w="5328"/>
-            <w:vAlign w:val="center"/>
-          </w:tcPr>
-          <w:p>
-            <w:pPr>
-              <w:spacing w:after="0"/>
-            </w:pPr>
-            <w:r/>
-            <w:r>
-              <w:rPr>
-                <w:rFonts w:ascii="Calibri" w:hAnsi="Calibri"/>
-                <w:b w:val="0"/>
-                <w:sz w:val="20"/>
-              </w:rPr>
-              <w:t>Maximum pages for one keyword.</w:t>
-            </w:r>
-          </w:p>
-        </w:tc>
-      </w:tr>
-      <w:tr>
-        <w:tc>
-          <w:tcPr>
-            <w:tcW w:type="dxa" w:w="2448"/>
-            <w:vAlign w:val="center"/>
-          </w:tcPr>
-          <w:p>
-            <w:pPr>
-              <w:spacing w:after="0"/>
-            </w:pPr>
-            <w:r/>
-            <w:r>
-              <w:rPr>
-                <w:rFonts w:ascii="Calibri" w:hAnsi="Calibri"/>
-                <w:b w:val="0"/>
-                <w:sz w:val="20"/>
-              </w:rPr>
-              <w:t>--skip-process</w:t>
-            </w:r>
-          </w:p>
-        </w:tc>
-        <w:tc>
-          <w:tcPr>
-            <w:tcW w:type="dxa" w:w="1584"/>
-            <w:vAlign w:val="center"/>
-          </w:tcPr>
-          <w:p>
-            <w:pPr>
-              <w:spacing w:after="0"/>
-            </w:pPr>
-            <w:r/>
-            <w:r>
-              <w:rPr>
-                <w:rFonts w:ascii="Calibri" w:hAnsi="Calibri"/>
-                <w:b w:val="0"/>
-                <w:sz w:val="20"/>
-              </w:rPr>
-              <w:t>sync</w:t>
-            </w:r>
-          </w:p>
-        </w:tc>
-        <w:tc>
-          <w:tcPr>
-            <w:tcW w:type="dxa" w:w="5328"/>
-            <w:vAlign w:val="center"/>
-          </w:tcPr>
-          <w:p>
-            <w:pPr>
-              <w:spacing w:after="0"/>
-            </w:pPr>
-            <w:r/>
-            <w:r>
-              <w:rPr>
-                <w:rFonts w:ascii="Calibri" w:hAnsi="Calibri"/>
-                <w:b w:val="0"/>
-                <w:sz w:val="20"/>
-              </w:rPr>
-              <w:t>Ingest raw only; do not process.</w:t>
-            </w:r>
-          </w:p>
-        </w:tc>
-      </w:tr>
-      <w:tr>
-        <w:tc>
-          <w:tcPr>
-            <w:tcW w:type="dxa" w:w="2448"/>
-            <w:vAlign w:val="center"/>
-          </w:tcPr>
-          <w:p>
-            <w:pPr>
-              <w:spacing w:after="0"/>
-            </w:pPr>
-            <w:r/>
-            <w:r>
-              <w:rPr>
-                <w:rFonts w:ascii="Calibri" w:hAnsi="Calibri"/>
-                <w:b w:val="0"/>
-                <w:sz w:val="20"/>
-              </w:rPr>
-              <w:t>--process</w:t>
-            </w:r>
-          </w:p>
-        </w:tc>
-        <w:tc>
-          <w:tcPr>
-            <w:tcW w:type="dxa" w:w="1584"/>
-            <w:vAlign w:val="center"/>
-          </w:tcPr>
-          <w:p>
-            <w:pPr>
-              <w:spacing w:after="0"/>
-            </w:pPr>
-            <w:r/>
-            <w:r>
-              <w:rPr>
-                <w:rFonts w:ascii="Calibri" w:hAnsi="Calibri"/>
-                <w:b w:val="0"/>
-                <w:sz w:val="20"/>
-              </w:rPr>
-              <w:t>ingest</w:t>
-            </w:r>
-          </w:p>
-        </w:tc>
-        <w:tc>
-          <w:tcPr>
-            <w:tcW w:type="dxa" w:w="5328"/>
-            <w:vAlign w:val="center"/>
-          </w:tcPr>
-          <w:p>
-            <w:pPr>
-              <w:spacing w:after="0"/>
-            </w:pPr>
-            <w:r/>
-            <w:r>
-              <w:rPr>
-                <w:rFonts w:ascii="Calibri" w:hAnsi="Calibri"/>
-                <w:b w:val="0"/>
-                <w:sz w:val="20"/>
-              </w:rPr>
-              <w:t>Process changed raw works after ingest.</w:t>
-            </w:r>
-          </w:p>
-        </w:tc>
-      </w:tr>
-      <w:tr>
-        <w:tc>
-          <w:tcPr>
-            <w:tcW w:type="dxa" w:w="2448"/>
-            <w:vAlign w:val="center"/>
-          </w:tcPr>
-          <w:p>
-            <w:pPr>
-              <w:spacing w:after="0"/>
-            </w:pPr>
-            <w:r/>
-            <w:r>
-              <w:rPr>
-                <w:rFonts w:ascii="Calibri" w:hAnsi="Calibri"/>
-                <w:b w:val="0"/>
-                <w:sz w:val="20"/>
-              </w:rPr>
-              <w:t>--enrich-authors</w:t>
-            </w:r>
-          </w:p>
-        </w:tc>
-        <w:tc>
-          <w:tcPr>
-            <w:tcW w:type="dxa" w:w="1584"/>
-            <w:vAlign w:val="center"/>
-          </w:tcPr>
-          <w:p>
-            <w:pPr>
-              <w:spacing w:after="0"/>
-            </w:pPr>
-            <w:r/>
-            <w:r>
-              <w:rPr>
-                <w:rFonts w:ascii="Calibri" w:hAnsi="Calibri"/>
-                <w:b w:val="0"/>
-                <w:sz w:val="20"/>
-              </w:rPr>
-              <w:t>sync</w:t>
-            </w:r>
-          </w:p>
-        </w:tc>
-        <w:tc>
-          <w:tcPr>
-            <w:tcW w:type="dxa" w:w="5328"/>
-            <w:vAlign w:val="center"/>
-          </w:tcPr>
-          <w:p>
-            <w:pPr>
-              <w:spacing w:after="0"/>
-            </w:pPr>
-            <w:r/>
-            <w:r>
-              <w:rPr>
-                <w:rFonts w:ascii="Calibri" w:hAnsi="Calibri"/>
-                <w:b w:val="0"/>
-                <w:sz w:val="20"/>
-              </w:rPr>
-              <w:t>Run author detail enrichment after works sync.</w:t>
-            </w:r>
-          </w:p>
-        </w:tc>
-      </w:tr>
-      <w:tr>
-        <w:tc>
-          <w:tcPr>
-            <w:tcW w:type="dxa" w:w="2448"/>
-            <w:vAlign w:val="center"/>
-          </w:tcPr>
-          <w:p>
-            <w:pPr>
-              <w:spacing w:after="0"/>
-            </w:pPr>
-            <w:r/>
-            <w:r>
-              <w:rPr>
-                <w:rFonts w:ascii="Calibri" w:hAnsi="Calibri"/>
-                <w:b w:val="0"/>
-                <w:sz w:val="20"/>
-              </w:rPr>
-              <w:t>--enrich-sources</w:t>
-            </w:r>
-          </w:p>
-        </w:tc>
-        <w:tc>
-          <w:tcPr>
-            <w:tcW w:type="dxa" w:w="1584"/>
-            <w:vAlign w:val="center"/>
-          </w:tcPr>
-          <w:p>
-            <w:pPr>
-              <w:spacing w:after="0"/>
-            </w:pPr>
-            <w:r/>
-            <w:r>
-              <w:rPr>
-                <w:rFonts w:ascii="Calibri" w:hAnsi="Calibri"/>
-                <w:b w:val="0"/>
-                <w:sz w:val="20"/>
-              </w:rPr>
-              <w:t>sync</w:t>
-            </w:r>
-          </w:p>
-        </w:tc>
-        <w:tc>
-          <w:tcPr>
-            <w:tcW w:type="dxa" w:w="5328"/>
-            <w:vAlign w:val="center"/>
-          </w:tcPr>
-          <w:p>
-            <w:pPr>
-              <w:spacing w:after="0"/>
-            </w:pPr>
-            <w:r/>
-            <w:r>
-              <w:rPr>
-                <w:rFonts w:ascii="Calibri" w:hAnsi="Calibri"/>
-                <w:b w:val="0"/>
-                <w:sz w:val="20"/>
-              </w:rPr>
-              <w:t>Run source detail enrichment after works sync.</w:t>
+              <w:t>Tiếp tục cursor window cũ. Nếu là initial resume thì không gửi updated-date filter.</w:t>
             </w:r>
           </w:p>
         </w:tc>
@@ -1841,479 +1114,34 @@
         <w:pStyle w:val="Heading1"/>
       </w:pPr>
       <w:r>
-        <w:t>5. Watermark Behavior</w:t>
+        <w:t>5. Command Mẫu</w:t>
       </w:r>
     </w:p>
     <w:p>
       <w:r>
-        <w:t>The table ops.crawl_watermarks stores one row per source/entity/scope. For works keyword sync, scope_type is keyword and scope_value is the keyword text.</w:t>
-      </w:r>
-    </w:p>
-    <w:tbl>
-      <w:tblPr>
-        <w:tblStyle w:val="TableGrid"/>
-        <w:tblW w:type="auto" w:w="0"/>
-        <w:jc w:val="center"/>
-        <w:tblLook w:firstColumn="1" w:firstRow="1" w:lastColumn="0" w:lastRow="0" w:noHBand="0" w:noVBand="1" w:val="04A0"/>
-      </w:tblPr>
-      <w:tblGrid>
-        <w:gridCol w:w="4680"/>
-        <w:gridCol w:w="4680"/>
-      </w:tblGrid>
-      <w:tr>
-        <w:tc>
-          <w:tcPr>
-            <w:tcW w:type="dxa" w:w="2880"/>
-            <w:shd w:fill="E8EEF5"/>
-            <w:vAlign w:val="center"/>
-          </w:tcPr>
-          <w:p>
-            <w:pPr>
-              <w:spacing w:after="0"/>
-            </w:pPr>
-            <w:r/>
-            <w:r>
-              <w:rPr>
-                <w:rFonts w:ascii="Calibri" w:hAnsi="Calibri"/>
-                <w:b/>
-                <w:sz w:val="20"/>
-              </w:rPr>
-              <w:t>Column</w:t>
-            </w:r>
-          </w:p>
-        </w:tc>
-        <w:tc>
-          <w:tcPr>
-            <w:tcW w:type="dxa" w:w="6480"/>
-            <w:shd w:fill="E8EEF5"/>
-            <w:vAlign w:val="center"/>
-          </w:tcPr>
-          <w:p>
-            <w:pPr>
-              <w:spacing w:after="0"/>
-            </w:pPr>
-            <w:r/>
-            <w:r>
-              <w:rPr>
-                <w:rFonts w:ascii="Calibri" w:hAnsi="Calibri"/>
-                <w:b/>
-                <w:sz w:val="20"/>
-              </w:rPr>
-              <w:t>Meaning</w:t>
-            </w:r>
-          </w:p>
-        </w:tc>
-      </w:tr>
-      <w:tr>
-        <w:tc>
-          <w:tcPr>
-            <w:tcW w:type="dxa" w:w="2880"/>
-            <w:vAlign w:val="center"/>
-          </w:tcPr>
-          <w:p>
-            <w:pPr>
-              <w:spacing w:after="0"/>
-            </w:pPr>
-            <w:r/>
-            <w:r>
-              <w:rPr>
-                <w:rFonts w:ascii="Calibri" w:hAnsi="Calibri"/>
-                <w:b w:val="0"/>
-                <w:sz w:val="20"/>
-              </w:rPr>
-              <w:t>last_cursor</w:t>
-            </w:r>
-          </w:p>
-        </w:tc>
-        <w:tc>
-          <w:tcPr>
-            <w:tcW w:type="dxa" w:w="6480"/>
-            <w:vAlign w:val="center"/>
-          </w:tcPr>
-          <w:p>
-            <w:pPr>
-              <w:spacing w:after="0"/>
-            </w:pPr>
-            <w:r/>
-            <w:r>
-              <w:rPr>
-                <w:rFonts w:ascii="Calibri" w:hAnsi="Calibri"/>
-                <w:b w:val="0"/>
-                <w:sz w:val="20"/>
-              </w:rPr>
-              <w:t>Cursor to resume from when the previous run stopped before completing the current window.</w:t>
-            </w:r>
-          </w:p>
-        </w:tc>
-      </w:tr>
-      <w:tr>
-        <w:tc>
-          <w:tcPr>
-            <w:tcW w:type="dxa" w:w="2880"/>
-            <w:vAlign w:val="center"/>
-          </w:tcPr>
-          <w:p>
-            <w:pPr>
-              <w:spacing w:after="0"/>
-            </w:pPr>
-            <w:r/>
-            <w:r>
-              <w:rPr>
-                <w:rFonts w:ascii="Calibri" w:hAnsi="Calibri"/>
-                <w:b w:val="0"/>
-                <w:sz w:val="20"/>
-              </w:rPr>
-              <w:t>last_from_updated_date</w:t>
-            </w:r>
-          </w:p>
-        </w:tc>
-        <w:tc>
-          <w:tcPr>
-            <w:tcW w:type="dxa" w:w="6480"/>
-            <w:vAlign w:val="center"/>
-          </w:tcPr>
-          <w:p>
-            <w:pPr>
-              <w:spacing w:after="0"/>
-            </w:pPr>
-            <w:r/>
-            <w:r>
-              <w:rPr>
-                <w:rFonts w:ascii="Calibri" w:hAnsi="Calibri"/>
-                <w:b w:val="0"/>
-                <w:sz w:val="20"/>
-              </w:rPr>
-              <w:t>Start of the current incremental window. Null for initial crawl.</w:t>
-            </w:r>
-          </w:p>
-        </w:tc>
-      </w:tr>
-      <w:tr>
-        <w:tc>
-          <w:tcPr>
-            <w:tcW w:type="dxa" w:w="2880"/>
-            <w:vAlign w:val="center"/>
-          </w:tcPr>
-          <w:p>
-            <w:pPr>
-              <w:spacing w:after="0"/>
-            </w:pPr>
-            <w:r/>
-            <w:r>
-              <w:rPr>
-                <w:rFonts w:ascii="Calibri" w:hAnsi="Calibri"/>
-                <w:b w:val="0"/>
-                <w:sz w:val="20"/>
-              </w:rPr>
-              <w:t>last_to_updated_date</w:t>
-            </w:r>
-          </w:p>
-        </w:tc>
-        <w:tc>
-          <w:tcPr>
-            <w:tcW w:type="dxa" w:w="6480"/>
-            <w:vAlign w:val="center"/>
-          </w:tcPr>
-          <w:p>
-            <w:pPr>
-              <w:spacing w:after="0"/>
-            </w:pPr>
-            <w:r/>
-            <w:r>
-              <w:rPr>
-                <w:rFonts w:ascii="Calibri" w:hAnsi="Calibri"/>
-                <w:b w:val="0"/>
-                <w:sz w:val="20"/>
-              </w:rPr>
-              <w:t>End of the latest successful crawl window. Used as next from_updated_date.</w:t>
-            </w:r>
-          </w:p>
-        </w:tc>
-      </w:tr>
-      <w:tr>
-        <w:tc>
-          <w:tcPr>
-            <w:tcW w:type="dxa" w:w="2880"/>
-            <w:vAlign w:val="center"/>
-          </w:tcPr>
-          <w:p>
-            <w:pPr>
-              <w:spacing w:after="0"/>
-            </w:pPr>
-            <w:r/>
-            <w:r>
-              <w:rPr>
-                <w:rFonts w:ascii="Calibri" w:hAnsi="Calibri"/>
-                <w:b w:val="0"/>
-                <w:sz w:val="20"/>
-              </w:rPr>
-              <w:t>last_processed_record_id</w:t>
-            </w:r>
-          </w:p>
-        </w:tc>
-        <w:tc>
-          <w:tcPr>
-            <w:tcW w:type="dxa" w:w="6480"/>
-            <w:vAlign w:val="center"/>
-          </w:tcPr>
-          <w:p>
-            <w:pPr>
-              <w:spacing w:after="0"/>
-            </w:pPr>
-            <w:r/>
-            <w:r>
-              <w:rPr>
-                <w:rFonts w:ascii="Calibri" w:hAnsi="Calibri"/>
-                <w:b w:val="0"/>
-                <w:sz w:val="20"/>
-              </w:rPr>
-              <w:t>Last OpenAlex record id seen in the latest page.</w:t>
-            </w:r>
-          </w:p>
-        </w:tc>
-      </w:tr>
-      <w:tr>
-        <w:tc>
-          <w:tcPr>
-            <w:tcW w:type="dxa" w:w="2880"/>
-            <w:vAlign w:val="center"/>
-          </w:tcPr>
-          <w:p>
-            <w:pPr>
-              <w:spacing w:after="0"/>
-            </w:pPr>
-            <w:r/>
-            <w:r>
-              <w:rPr>
-                <w:rFonts w:ascii="Calibri" w:hAnsi="Calibri"/>
-                <w:b w:val="0"/>
-                <w:sz w:val="20"/>
-              </w:rPr>
-              <w:t>metadata</w:t>
-            </w:r>
-          </w:p>
-        </w:tc>
-        <w:tc>
-          <w:tcPr>
-            <w:tcW w:type="dxa" w:w="6480"/>
-            <w:vAlign w:val="center"/>
-          </w:tcPr>
-          <w:p>
-            <w:pPr>
-              <w:spacing w:after="0"/>
-            </w:pPr>
-            <w:r/>
-            <w:r>
-              <w:rPr>
-                <w:rFonts w:ascii="Calibri" w:hAnsi="Calibri"/>
-                <w:b w:val="0"/>
-                <w:sz w:val="20"/>
-              </w:rPr>
-              <w:t>JSON with crawl_mode, per_page, max_pages, changed count, and related job ids.</w:t>
-            </w:r>
-          </w:p>
-        </w:tc>
-      </w:tr>
-    </w:tbl>
-    <w:p/>
-    <w:p>
-      <w:pPr>
-        <w:pStyle w:val="Heading2"/>
-      </w:pPr>
-      <w:r>
-        <w:t>5.1 Useful SQL Checks</w:t>
+        <w:rPr>
+          <w:rFonts w:ascii="Consolas" w:hAnsi="Consolas"/>
+          <w:sz w:val="18"/>
+        </w:rPr>
+        <w:t>python -m src.jobs.sync.openalex_works --keywords "machine learning" --per-page 25 --max-pages-per-keyword 1 --page-delay-seconds 2</w:t>
       </w:r>
     </w:p>
     <w:p>
-      <w:pPr>
-        <w:pStyle w:val="CodeBlock"/>
-      </w:pPr>
       <w:r>
-        <w:t>SELECT</w:t>
+        <w:rPr>
+          <w:rFonts w:ascii="Consolas" w:hAnsi="Consolas"/>
+          <w:sz w:val="18"/>
+        </w:rPr>
+        <w:t>python -m src.jobs.sync.openalex_works --keywords "machine learning" "deep learning" --per-page 10 --max-pages-per-keyword 1 --enrich-authors --enrich-sources --enrich-limit 300</w:t>
       </w:r>
     </w:p>
     <w:p>
-      <w:pPr>
-        <w:pStyle w:val="CodeBlock"/>
-      </w:pPr>
       <w:r>
-        <w:t xml:space="preserve">    scope_value,</w:t>
-      </w:r>
-    </w:p>
-    <w:p>
-      <w:pPr>
-        <w:pStyle w:val="CodeBlock"/>
-      </w:pPr>
-      <w:r>
-        <w:t xml:space="preserve">    last_cursor,</w:t>
-      </w:r>
-    </w:p>
-    <w:p>
-      <w:pPr>
-        <w:pStyle w:val="CodeBlock"/>
-      </w:pPr>
-      <w:r>
-        <w:t xml:space="preserve">    last_from_updated_date,</w:t>
-      </w:r>
-    </w:p>
-    <w:p>
-      <w:pPr>
-        <w:pStyle w:val="CodeBlock"/>
-      </w:pPr>
-      <w:r>
-        <w:t xml:space="preserve">    last_to_updated_date,</w:t>
-      </w:r>
-    </w:p>
-    <w:p>
-      <w:pPr>
-        <w:pStyle w:val="CodeBlock"/>
-      </w:pPr>
-      <w:r>
-        <w:t xml:space="preserve">    JSON_VALUE(metadata, '$.crawl_mode') AS crawl_mode,</w:t>
-      </w:r>
-    </w:p>
-    <w:p>
-      <w:pPr>
-        <w:pStyle w:val="CodeBlock"/>
-      </w:pPr>
-      <w:r>
-        <w:t xml:space="preserve">    metadata</w:t>
-      </w:r>
-    </w:p>
-    <w:p>
-      <w:pPr>
-        <w:pStyle w:val="CodeBlock"/>
-      </w:pPr>
-      <w:r>
-        <w:t>FROM ops.crawl_watermarks</w:t>
-      </w:r>
-    </w:p>
-    <w:p>
-      <w:pPr>
-        <w:pStyle w:val="CodeBlock"/>
-      </w:pPr>
-      <w:r>
-        <w:t>WHERE source_entity = 'works'</w:t>
-      </w:r>
-    </w:p>
-    <w:p>
-      <w:pPr>
-        <w:pStyle w:val="CodeBlock"/>
-      </w:pPr>
-      <w:r>
-        <w:t>ORDER BY updated_at DESC;</w:t>
-      </w:r>
-    </w:p>
-    <w:p>
-      <w:pPr>
-        <w:pStyle w:val="CodeBlock"/>
-      </w:pPr>
-      <w:r>
-        <w:t>SELECT TOP 50</w:t>
-      </w:r>
-    </w:p>
-    <w:p>
-      <w:pPr>
-        <w:pStyle w:val="CodeBlock"/>
-      </w:pPr>
-      <w:r>
-        <w:t xml:space="preserve">    job_name,</w:t>
-      </w:r>
-    </w:p>
-    <w:p>
-      <w:pPr>
-        <w:pStyle w:val="CodeBlock"/>
-      </w:pPr>
-      <w:r>
-        <w:t xml:space="preserve">    job_type,</w:t>
-      </w:r>
-    </w:p>
-    <w:p>
-      <w:pPr>
-        <w:pStyle w:val="CodeBlock"/>
-      </w:pPr>
-      <w:r>
-        <w:t xml:space="preserve">    source_entity,</w:t>
-      </w:r>
-    </w:p>
-    <w:p>
-      <w:pPr>
-        <w:pStyle w:val="CodeBlock"/>
-      </w:pPr>
-      <w:r>
-        <w:t xml:space="preserve">    scope_value,</w:t>
-      </w:r>
-    </w:p>
-    <w:p>
-      <w:pPr>
-        <w:pStyle w:val="CodeBlock"/>
-      </w:pPr>
-      <w:r>
-        <w:t xml:space="preserve">    status,</w:t>
-      </w:r>
-    </w:p>
-    <w:p>
-      <w:pPr>
-        <w:pStyle w:val="CodeBlock"/>
-      </w:pPr>
-      <w:r>
-        <w:t xml:space="preserve">    JSON_VALUE(metadata, '$.crawl_mode') AS crawl_mode,</w:t>
-      </w:r>
-    </w:p>
-    <w:p>
-      <w:pPr>
-        <w:pStyle w:val="CodeBlock"/>
-      </w:pPr>
-      <w:r>
-        <w:t xml:space="preserve">    started_at,</w:t>
-      </w:r>
-    </w:p>
-    <w:p>
-      <w:pPr>
-        <w:pStyle w:val="CodeBlock"/>
-      </w:pPr>
-      <w:r>
-        <w:t xml:space="preserve">    finished_at,</w:t>
-      </w:r>
-    </w:p>
-    <w:p>
-      <w:pPr>
-        <w:pStyle w:val="CodeBlock"/>
-      </w:pPr>
-      <w:r>
-        <w:t xml:space="preserve">    records_in,</w:t>
-      </w:r>
-    </w:p>
-    <w:p>
-      <w:pPr>
-        <w:pStyle w:val="CodeBlock"/>
-      </w:pPr>
-      <w:r>
-        <w:t xml:space="preserve">    records_out,</w:t>
-      </w:r>
-    </w:p>
-    <w:p>
-      <w:pPr>
-        <w:pStyle w:val="CodeBlock"/>
-      </w:pPr>
-      <w:r>
-        <w:t xml:space="preserve">    records_failed</w:t>
-      </w:r>
-    </w:p>
-    <w:p>
-      <w:pPr>
-        <w:pStyle w:val="CodeBlock"/>
-      </w:pPr>
-      <w:r>
-        <w:t>FROM ops.job_runs</w:t>
-      </w:r>
-    </w:p>
-    <w:p>
-      <w:pPr>
-        <w:pStyle w:val="CodeBlock"/>
-      </w:pPr>
-      <w:r>
-        <w:t>ORDER BY started_at DESC;</w:t>
+        <w:rPr>
+          <w:rFonts w:ascii="Consolas" w:hAnsi="Consolas"/>
+          <w:sz w:val="18"/>
+        </w:rPr>
+        <w:t>python -m src.jobs.reprocess.all --works-limit 100 --authors-limit 100 --sources-limit 100</w:t>
       </w:r>
     </w:p>
     <w:p>
@@ -2321,907 +1149,154 @@
         <w:pStyle w:val="Heading1"/>
       </w:pPr>
       <w:r>
-        <w:t>6. Environment Variables</w:t>
+        <w:t>6. Quy Tắc Vận Hành An Toàn</w:t>
       </w:r>
     </w:p>
-    <w:tbl>
-      <w:tblPr>
-        <w:tblStyle w:val="TableGrid"/>
-        <w:tblW w:type="auto" w:w="0"/>
-        <w:jc w:val="center"/>
-        <w:tblLook w:firstColumn="1" w:firstRow="1" w:lastColumn="0" w:lastRow="0" w:noHBand="0" w:noVBand="1" w:val="04A0"/>
-      </w:tblPr>
-      <w:tblGrid>
-        <w:gridCol w:w="3120"/>
-        <w:gridCol w:w="3120"/>
-        <w:gridCol w:w="3120"/>
-      </w:tblGrid>
-      <w:tr>
-        <w:tc>
-          <w:tcPr>
-            <w:tcW w:type="dxa" w:w="3168"/>
-            <w:shd w:fill="E8EEF5"/>
-            <w:vAlign w:val="center"/>
-          </w:tcPr>
-          <w:p>
-            <w:pPr>
-              <w:spacing w:after="0"/>
-            </w:pPr>
-            <w:r/>
-            <w:r>
-              <w:rPr>
-                <w:rFonts w:ascii="Calibri" w:hAnsi="Calibri"/>
-                <w:b/>
-                <w:sz w:val="20"/>
-              </w:rPr>
-              <w:t>Variable</w:t>
-            </w:r>
-          </w:p>
-        </w:tc>
-        <w:tc>
-          <w:tcPr>
-            <w:tcW w:type="dxa" w:w="1584"/>
-            <w:shd w:fill="E8EEF5"/>
-            <w:vAlign w:val="center"/>
-          </w:tcPr>
-          <w:p>
-            <w:pPr>
-              <w:spacing w:after="0"/>
-            </w:pPr>
-            <w:r/>
-            <w:r>
-              <w:rPr>
-                <w:rFonts w:ascii="Calibri" w:hAnsi="Calibri"/>
-                <w:b/>
-                <w:sz w:val="20"/>
-              </w:rPr>
-              <w:t>Required</w:t>
-            </w:r>
-          </w:p>
-        </w:tc>
-        <w:tc>
-          <w:tcPr>
-            <w:tcW w:type="dxa" w:w="4608"/>
-            <w:shd w:fill="E8EEF5"/>
-            <w:vAlign w:val="center"/>
-          </w:tcPr>
-          <w:p>
-            <w:pPr>
-              <w:spacing w:after="0"/>
-            </w:pPr>
-            <w:r/>
-            <w:r>
-              <w:rPr>
-                <w:rFonts w:ascii="Calibri" w:hAnsi="Calibri"/>
-                <w:b/>
-                <w:sz w:val="20"/>
-              </w:rPr>
-              <w:t>Purpose</w:t>
-            </w:r>
-          </w:p>
-        </w:tc>
-      </w:tr>
-      <w:tr>
-        <w:tc>
-          <w:tcPr>
-            <w:tcW w:type="dxa" w:w="3168"/>
-            <w:vAlign w:val="center"/>
-          </w:tcPr>
-          <w:p>
-            <w:pPr>
-              <w:spacing w:after="0"/>
-            </w:pPr>
-            <w:r/>
-            <w:r>
-              <w:rPr>
-                <w:rFonts w:ascii="Calibri" w:hAnsi="Calibri"/>
-                <w:b w:val="0"/>
-                <w:sz w:val="20"/>
-              </w:rPr>
-              <w:t>OPENALEX_BASE_URL</w:t>
-            </w:r>
-          </w:p>
-        </w:tc>
-        <w:tc>
-          <w:tcPr>
-            <w:tcW w:type="dxa" w:w="1584"/>
-            <w:vAlign w:val="center"/>
-          </w:tcPr>
-          <w:p>
-            <w:pPr>
-              <w:spacing w:after="0"/>
-            </w:pPr>
-            <w:r/>
-            <w:r>
-              <w:rPr>
-                <w:rFonts w:ascii="Calibri" w:hAnsi="Calibri"/>
-                <w:b w:val="0"/>
-                <w:sz w:val="20"/>
-              </w:rPr>
-              <w:t>Yes</w:t>
-            </w:r>
-          </w:p>
-        </w:tc>
-        <w:tc>
-          <w:tcPr>
-            <w:tcW w:type="dxa" w:w="4608"/>
-            <w:vAlign w:val="center"/>
-          </w:tcPr>
-          <w:p>
-            <w:pPr>
-              <w:spacing w:after="0"/>
-            </w:pPr>
-            <w:r/>
-            <w:r>
-              <w:rPr>
-                <w:rFonts w:ascii="Calibri" w:hAnsi="Calibri"/>
-                <w:b w:val="0"/>
-                <w:sz w:val="20"/>
-              </w:rPr>
-              <w:t>Base API URL, usually https://api.openalex.org.</w:t>
-            </w:r>
-          </w:p>
-        </w:tc>
-      </w:tr>
-      <w:tr>
-        <w:tc>
-          <w:tcPr>
-            <w:tcW w:type="dxa" w:w="3168"/>
-            <w:vAlign w:val="center"/>
-          </w:tcPr>
-          <w:p>
-            <w:pPr>
-              <w:spacing w:after="0"/>
-            </w:pPr>
-            <w:r/>
-            <w:r>
-              <w:rPr>
-                <w:rFonts w:ascii="Calibri" w:hAnsi="Calibri"/>
-                <w:b w:val="0"/>
-                <w:sz w:val="20"/>
-              </w:rPr>
-              <w:t>OPENALEX_MAILTO</w:t>
-            </w:r>
-          </w:p>
-        </w:tc>
-        <w:tc>
-          <w:tcPr>
-            <w:tcW w:type="dxa" w:w="1584"/>
-            <w:vAlign w:val="center"/>
-          </w:tcPr>
-          <w:p>
-            <w:pPr>
-              <w:spacing w:after="0"/>
-            </w:pPr>
-            <w:r/>
-            <w:r>
-              <w:rPr>
-                <w:rFonts w:ascii="Calibri" w:hAnsi="Calibri"/>
-                <w:b w:val="0"/>
-                <w:sz w:val="20"/>
-              </w:rPr>
-              <w:t>Recommended</w:t>
-            </w:r>
-          </w:p>
-        </w:tc>
-        <w:tc>
-          <w:tcPr>
-            <w:tcW w:type="dxa" w:w="4608"/>
-            <w:vAlign w:val="center"/>
-          </w:tcPr>
-          <w:p>
-            <w:pPr>
-              <w:spacing w:after="0"/>
-            </w:pPr>
-            <w:r/>
-            <w:r>
-              <w:rPr>
-                <w:rFonts w:ascii="Calibri" w:hAnsi="Calibri"/>
-                <w:b w:val="0"/>
-                <w:sz w:val="20"/>
-              </w:rPr>
-              <w:t>Adds mailto to OpenAlex requests for polite pool behavior.</w:t>
-            </w:r>
-          </w:p>
-        </w:tc>
-      </w:tr>
-      <w:tr>
-        <w:tc>
-          <w:tcPr>
-            <w:tcW w:type="dxa" w:w="3168"/>
-            <w:vAlign w:val="center"/>
-          </w:tcPr>
-          <w:p>
-            <w:pPr>
-              <w:spacing w:after="0"/>
-            </w:pPr>
-            <w:r/>
-            <w:r>
-              <w:rPr>
-                <w:rFonts w:ascii="Calibri" w:hAnsi="Calibri"/>
-                <w:b w:val="0"/>
-                <w:sz w:val="20"/>
-              </w:rPr>
-              <w:t>OPENALEX_API_KEY</w:t>
-            </w:r>
-          </w:p>
-        </w:tc>
-        <w:tc>
-          <w:tcPr>
-            <w:tcW w:type="dxa" w:w="1584"/>
-            <w:vAlign w:val="center"/>
-          </w:tcPr>
-          <w:p>
-            <w:pPr>
-              <w:spacing w:after="0"/>
-            </w:pPr>
-            <w:r/>
-            <w:r>
-              <w:rPr>
-                <w:rFonts w:ascii="Calibri" w:hAnsi="Calibri"/>
-                <w:b w:val="0"/>
-                <w:sz w:val="20"/>
-              </w:rPr>
-              <w:t>Recommended</w:t>
-            </w:r>
-          </w:p>
-        </w:tc>
-        <w:tc>
-          <w:tcPr>
-            <w:tcW w:type="dxa" w:w="4608"/>
-            <w:vAlign w:val="center"/>
-          </w:tcPr>
-          <w:p>
-            <w:pPr>
-              <w:spacing w:after="0"/>
-            </w:pPr>
-            <w:r/>
-            <w:r>
-              <w:rPr>
-                <w:rFonts w:ascii="Calibri" w:hAnsi="Calibri"/>
-                <w:b w:val="0"/>
-                <w:sz w:val="20"/>
-              </w:rPr>
-              <w:t>Adds api_key to OpenAlex requests to reduce anonymous rate limiting.</w:t>
-            </w:r>
-          </w:p>
-        </w:tc>
-      </w:tr>
-      <w:tr>
-        <w:tc>
-          <w:tcPr>
-            <w:tcW w:type="dxa" w:w="3168"/>
-            <w:vAlign w:val="center"/>
-          </w:tcPr>
-          <w:p>
-            <w:pPr>
-              <w:spacing w:after="0"/>
-            </w:pPr>
-            <w:r/>
-            <w:r>
-              <w:rPr>
-                <w:rFonts w:ascii="Calibri" w:hAnsi="Calibri"/>
-                <w:b w:val="0"/>
-                <w:sz w:val="20"/>
-              </w:rPr>
-              <w:t>OPENALEX_PAGE_DELAY_SECONDS</w:t>
-            </w:r>
-          </w:p>
-        </w:tc>
-        <w:tc>
-          <w:tcPr>
-            <w:tcW w:type="dxa" w:w="1584"/>
-            <w:vAlign w:val="center"/>
-          </w:tcPr>
-          <w:p>
-            <w:pPr>
-              <w:spacing w:after="0"/>
-            </w:pPr>
-            <w:r/>
-            <w:r>
-              <w:rPr>
-                <w:rFonts w:ascii="Calibri" w:hAnsi="Calibri"/>
-                <w:b w:val="0"/>
-                <w:sz w:val="20"/>
-              </w:rPr>
-              <w:t>Optional</w:t>
-            </w:r>
-          </w:p>
-        </w:tc>
-        <w:tc>
-          <w:tcPr>
-            <w:tcW w:type="dxa" w:w="4608"/>
-            <w:vAlign w:val="center"/>
-          </w:tcPr>
-          <w:p>
-            <w:pPr>
-              <w:spacing w:after="0"/>
-            </w:pPr>
-            <w:r/>
-            <w:r>
-              <w:rPr>
-                <w:rFonts w:ascii="Calibri" w:hAnsi="Calibri"/>
-                <w:b w:val="0"/>
-                <w:sz w:val="20"/>
-              </w:rPr>
-              <w:t>Delay between cursor pages. Default: 1.</w:t>
-            </w:r>
-          </w:p>
-        </w:tc>
-      </w:tr>
-      <w:tr>
-        <w:tc>
-          <w:tcPr>
-            <w:tcW w:type="dxa" w:w="3168"/>
-            <w:vAlign w:val="center"/>
-          </w:tcPr>
-          <w:p>
-            <w:pPr>
-              <w:spacing w:after="0"/>
-            </w:pPr>
-            <w:r/>
-            <w:r>
-              <w:rPr>
-                <w:rFonts w:ascii="Calibri" w:hAnsi="Calibri"/>
-                <w:b w:val="0"/>
-                <w:sz w:val="20"/>
-              </w:rPr>
-              <w:t>OPENALEX_KEYWORD_DELAY_SECONDS</w:t>
-            </w:r>
-          </w:p>
-        </w:tc>
-        <w:tc>
-          <w:tcPr>
-            <w:tcW w:type="dxa" w:w="1584"/>
-            <w:vAlign w:val="center"/>
-          </w:tcPr>
-          <w:p>
-            <w:pPr>
-              <w:spacing w:after="0"/>
-            </w:pPr>
-            <w:r/>
-            <w:r>
-              <w:rPr>
-                <w:rFonts w:ascii="Calibri" w:hAnsi="Calibri"/>
-                <w:b w:val="0"/>
-                <w:sz w:val="20"/>
-              </w:rPr>
-              <w:t>Optional</w:t>
-            </w:r>
-          </w:p>
-        </w:tc>
-        <w:tc>
-          <w:tcPr>
-            <w:tcW w:type="dxa" w:w="4608"/>
-            <w:vAlign w:val="center"/>
-          </w:tcPr>
-          <w:p>
-            <w:pPr>
-              <w:spacing w:after="0"/>
-            </w:pPr>
-            <w:r/>
-            <w:r>
-              <w:rPr>
-                <w:rFonts w:ascii="Calibri" w:hAnsi="Calibri"/>
-                <w:b w:val="0"/>
-                <w:sz w:val="20"/>
-              </w:rPr>
-              <w:t>Delay between keywords. Default: 2.</w:t>
-            </w:r>
-          </w:p>
-        </w:tc>
-      </w:tr>
-    </w:tbl>
-    <w:p/>
+    <w:p>
+      <w:pPr>
+        <w:pStyle w:val="ListBullet"/>
+      </w:pPr>
+      <w:r>
+        <w:t>Manual run nên dùng max-pages nhỏ để tránh backfill quá lớn.</w:t>
+      </w:r>
+    </w:p>
+    <w:p>
+      <w:pPr>
+        <w:pStyle w:val="ListBullet"/>
+      </w:pPr>
+      <w:r>
+        <w:t>Nếu log hiển thị keywords=1 trong khi truyền nhiều keyword, kiểm tra cách quote keyword hoặc image đang chạy.</w:t>
+      </w:r>
+    </w:p>
+    <w:p>
+      <w:pPr>
+        <w:pStyle w:val="ListBullet"/>
+      </w:pPr>
+      <w:r>
+        <w:t>Không dùng sa cho pipeline; dùng pipeline_user.</w:t>
+      </w:r>
+    </w:p>
+    <w:p>
+      <w:pPr>
+        <w:pStyle w:val="ListBullet"/>
+      </w:pPr>
+      <w:r>
+        <w:t>Khi chạy trong container trên EC2, SQL Server nên được gọi qua host.docker.internal,1433 nếu SQL Server expose port trên host.</w:t>
+      </w:r>
+    </w:p>
+    <w:p>
+      <w:pPr>
+        <w:pStyle w:val="ListBullet"/>
+      </w:pPr>
+      <w:r>
+        <w:t>Theo dõi ops.job_runs.records_failed và raw pending backlog sau mỗi batch.</w:t>
+      </w:r>
+    </w:p>
+    <w:p>
+      <w:pPr>
+        <w:pStyle w:val="ListBullet"/>
+      </w:pPr>
+      <w:r>
+        <w:t>Không nới constraint database ngay trong DAG vận hành; xử lý riêng ở Data Quality phase.</w:t>
+      </w:r>
+    </w:p>
     <w:p>
       <w:pPr>
         <w:pStyle w:val="Heading1"/>
       </w:pPr>
       <w:r>
-        <w:t>7. Known Issues and Backlog</w:t>
+        <w:t>7. Kiểm Tra Sau Khi Chạy</w:t>
       </w:r>
     </w:p>
-    <w:tbl>
-      <w:tblPr>
-        <w:tblStyle w:val="TableGrid"/>
-        <w:tblW w:type="auto" w:w="0"/>
-        <w:jc w:val="center"/>
-        <w:tblLook w:firstColumn="1" w:firstRow="1" w:lastColumn="0" w:lastRow="0" w:noHBand="0" w:noVBand="1" w:val="04A0"/>
-      </w:tblPr>
-      <w:tblGrid>
-        <w:gridCol w:w="3120"/>
-        <w:gridCol w:w="3120"/>
-        <w:gridCol w:w="3120"/>
-      </w:tblGrid>
-      <w:tr>
-        <w:tc>
-          <w:tcPr>
-            <w:tcW w:type="dxa" w:w="2448"/>
-            <w:shd w:fill="E8EEF5"/>
-            <w:vAlign w:val="center"/>
-          </w:tcPr>
-          <w:p>
-            <w:pPr>
-              <w:spacing w:after="0"/>
-            </w:pPr>
-            <w:r/>
-            <w:r>
-              <w:rPr>
-                <w:rFonts w:ascii="Calibri" w:hAnsi="Calibri"/>
-                <w:b/>
-                <w:sz w:val="20"/>
-              </w:rPr>
-              <w:t>Area</w:t>
-            </w:r>
-          </w:p>
-        </w:tc>
-        <w:tc>
-          <w:tcPr>
-            <w:tcW w:type="dxa" w:w="3600"/>
-            <w:shd w:fill="E8EEF5"/>
-            <w:vAlign w:val="center"/>
-          </w:tcPr>
-          <w:p>
-            <w:pPr>
-              <w:spacing w:after="0"/>
-            </w:pPr>
-            <w:r/>
-            <w:r>
-              <w:rPr>
-                <w:rFonts w:ascii="Calibri" w:hAnsi="Calibri"/>
-                <w:b/>
-                <w:sz w:val="20"/>
-              </w:rPr>
-              <w:t>Current behavior</w:t>
-            </w:r>
-          </w:p>
-        </w:tc>
-        <w:tc>
-          <w:tcPr>
-            <w:tcW w:type="dxa" w:w="3312"/>
-            <w:shd w:fill="E8EEF5"/>
-            <w:vAlign w:val="center"/>
-          </w:tcPr>
-          <w:p>
-            <w:pPr>
-              <w:spacing w:after="0"/>
-            </w:pPr>
-            <w:r/>
-            <w:r>
-              <w:rPr>
-                <w:rFonts w:ascii="Calibri" w:hAnsi="Calibri"/>
-                <w:b/>
-                <w:sz w:val="20"/>
-              </w:rPr>
-              <w:t>Recommended follow-up</w:t>
-            </w:r>
-          </w:p>
-        </w:tc>
-      </w:tr>
-      <w:tr>
-        <w:tc>
-          <w:tcPr>
-            <w:tcW w:type="dxa" w:w="2448"/>
-            <w:vAlign w:val="center"/>
-          </w:tcPr>
-          <w:p>
-            <w:pPr>
-              <w:spacing w:after="0"/>
-            </w:pPr>
-            <w:r/>
-            <w:r>
-              <w:rPr>
-                <w:rFonts w:ascii="Calibri" w:hAnsi="Calibri"/>
-                <w:b w:val="0"/>
-                <w:sz w:val="20"/>
-              </w:rPr>
-              <w:t>OpenAlex 429</w:t>
-            </w:r>
-          </w:p>
-        </w:tc>
-        <w:tc>
-          <w:tcPr>
-            <w:tcW w:type="dxa" w:w="3600"/>
-            <w:vAlign w:val="center"/>
-          </w:tcPr>
-          <w:p>
-            <w:pPr>
-              <w:spacing w:after="0"/>
-            </w:pPr>
-            <w:r/>
-            <w:r>
-              <w:rPr>
-                <w:rFonts w:ascii="Calibri" w:hAnsi="Calibri"/>
-                <w:b w:val="0"/>
-                <w:sz w:val="20"/>
-              </w:rPr>
-              <w:t>Retry/backoff, mailto, api_key, and throttling are implemented.</w:t>
-            </w:r>
-          </w:p>
-        </w:tc>
-        <w:tc>
-          <w:tcPr>
-            <w:tcW w:type="dxa" w:w="3312"/>
-            <w:vAlign w:val="center"/>
-          </w:tcPr>
-          <w:p>
-            <w:pPr>
-              <w:spacing w:after="0"/>
-            </w:pPr>
-            <w:r/>
-            <w:r>
-              <w:rPr>
-                <w:rFonts w:ascii="Calibri" w:hAnsi="Calibri"/>
-                <w:b w:val="0"/>
-                <w:sz w:val="20"/>
-              </w:rPr>
-              <w:t>If 429 continues, increase delay or reduce max-pages per run.</w:t>
-            </w:r>
-          </w:p>
-        </w:tc>
-      </w:tr>
-      <w:tr>
-        <w:tc>
-          <w:tcPr>
-            <w:tcW w:type="dxa" w:w="2448"/>
-            <w:vAlign w:val="center"/>
-          </w:tcPr>
-          <w:p>
-            <w:pPr>
-              <w:spacing w:after="0"/>
-            </w:pPr>
-            <w:r/>
-            <w:r>
-              <w:rPr>
-                <w:rFonts w:ascii="Calibri" w:hAnsi="Calibri"/>
-                <w:b w:val="0"/>
-                <w:sz w:val="20"/>
-              </w:rPr>
-              <w:t>Source first_publication_year</w:t>
-            </w:r>
-          </w:p>
-        </w:tc>
-        <w:tc>
-          <w:tcPr>
-            <w:tcW w:type="dxa" w:w="3600"/>
-            <w:vAlign w:val="center"/>
-          </w:tcPr>
-          <w:p>
-            <w:pPr>
-              <w:spacing w:after="0"/>
-            </w:pPr>
-            <w:r/>
-            <w:r>
-              <w:rPr>
-                <w:rFonts w:ascii="Calibri" w:hAnsi="Calibri"/>
-                <w:b w:val="0"/>
-                <w:sz w:val="20"/>
-              </w:rPr>
-              <w:t>Some sources fail CK_core_journals_first_publication_year.</w:t>
-            </w:r>
-          </w:p>
-        </w:tc>
-        <w:tc>
-          <w:tcPr>
-            <w:tcW w:type="dxa" w:w="3312"/>
-            <w:vAlign w:val="center"/>
-          </w:tcPr>
-          <w:p>
-            <w:pPr>
-              <w:spacing w:after="0"/>
-            </w:pPr>
-            <w:r/>
-            <w:r>
-              <w:rPr>
-                <w:rFonts w:ascii="Calibri" w:hAnsi="Calibri"/>
-                <w:b w:val="0"/>
-                <w:sz w:val="20"/>
-              </w:rPr>
-              <w:t>Handle in data quality: null invalid years or revise accepted range.</w:t>
-            </w:r>
-          </w:p>
-        </w:tc>
-      </w:tr>
-      <w:tr>
-        <w:tc>
-          <w:tcPr>
-            <w:tcW w:type="dxa" w:w="2448"/>
-            <w:vAlign w:val="center"/>
-          </w:tcPr>
-          <w:p>
-            <w:pPr>
-              <w:spacing w:after="0"/>
-            </w:pPr>
-            <w:r/>
-            <w:r>
-              <w:rPr>
-                <w:rFonts w:ascii="Calibri" w:hAnsi="Calibri"/>
-                <w:b w:val="0"/>
-                <w:sz w:val="20"/>
-              </w:rPr>
-              <w:t>Data quality</w:t>
-            </w:r>
-          </w:p>
-        </w:tc>
-        <w:tc>
-          <w:tcPr>
-            <w:tcW w:type="dxa" w:w="3600"/>
-            <w:vAlign w:val="center"/>
-          </w:tcPr>
-          <w:p>
-            <w:pPr>
-              <w:spacing w:after="0"/>
-            </w:pPr>
-            <w:r/>
-            <w:r>
-              <w:rPr>
-                <w:rFonts w:ascii="Calibri" w:hAnsi="Calibri"/>
-                <w:b w:val="0"/>
-                <w:sz w:val="20"/>
-              </w:rPr>
-              <w:t>Optional nulls are accepted; invalid required fields fail processing.</w:t>
-            </w:r>
-          </w:p>
-        </w:tc>
-        <w:tc>
-          <w:tcPr>
-            <w:tcW w:type="dxa" w:w="3312"/>
-            <w:vAlign w:val="center"/>
-          </w:tcPr>
-          <w:p>
-            <w:pPr>
-              <w:spacing w:after="0"/>
-            </w:pPr>
-            <w:r/>
-            <w:r>
-              <w:rPr>
-                <w:rFonts w:ascii="Calibri" w:hAnsi="Calibri"/>
-                <w:b w:val="0"/>
-                <w:sz w:val="20"/>
-              </w:rPr>
-              <w:t>Add a quality layer after pipeline automation is stable.</w:t>
-            </w:r>
-          </w:p>
-        </w:tc>
-      </w:tr>
-      <w:tr>
-        <w:tc>
-          <w:tcPr>
-            <w:tcW w:type="dxa" w:w="2448"/>
-            <w:vAlign w:val="center"/>
-          </w:tcPr>
-          <w:p>
-            <w:pPr>
-              <w:spacing w:after="0"/>
-            </w:pPr>
-            <w:r/>
-            <w:r>
-              <w:rPr>
-                <w:rFonts w:ascii="Calibri" w:hAnsi="Calibri"/>
-                <w:b w:val="0"/>
-                <w:sz w:val="20"/>
-              </w:rPr>
-              <w:t>Mart/analysis tables</w:t>
-            </w:r>
-          </w:p>
-        </w:tc>
-        <w:tc>
-          <w:tcPr>
-            <w:tcW w:type="dxa" w:w="3600"/>
-            <w:vAlign w:val="center"/>
-          </w:tcPr>
-          <w:p>
-            <w:pPr>
-              <w:spacing w:after="0"/>
-            </w:pPr>
-            <w:r/>
-            <w:r>
-              <w:rPr>
-                <w:rFonts w:ascii="Calibri" w:hAnsi="Calibri"/>
-                <w:b w:val="0"/>
-                <w:sz w:val="20"/>
-              </w:rPr>
-              <w:t>Not implemented yet.</w:t>
-            </w:r>
-          </w:p>
-        </w:tc>
-        <w:tc>
-          <w:tcPr>
-            <w:tcW w:type="dxa" w:w="3312"/>
-            <w:vAlign w:val="center"/>
-          </w:tcPr>
-          <w:p>
-            <w:pPr>
-              <w:spacing w:after="0"/>
-            </w:pPr>
-            <w:r/>
-            <w:r>
-              <w:rPr>
-                <w:rFonts w:ascii="Calibri" w:hAnsi="Calibri"/>
-                <w:b w:val="0"/>
-                <w:sz w:val="20"/>
-              </w:rPr>
-              <w:t>Build after data quality rules are defined.</w:t>
-            </w:r>
-          </w:p>
-        </w:tc>
-      </w:tr>
-      <w:tr>
-        <w:tc>
-          <w:tcPr>
-            <w:tcW w:type="dxa" w:w="2448"/>
-            <w:vAlign w:val="center"/>
-          </w:tcPr>
-          <w:p>
-            <w:pPr>
-              <w:spacing w:after="0"/>
-            </w:pPr>
-            <w:r/>
-            <w:r>
-              <w:rPr>
-                <w:rFonts w:ascii="Calibri" w:hAnsi="Calibri"/>
-                <w:b w:val="0"/>
-                <w:sz w:val="20"/>
-              </w:rPr>
-              <w:t>Airflow</w:t>
-            </w:r>
-          </w:p>
-        </w:tc>
-        <w:tc>
-          <w:tcPr>
-            <w:tcW w:type="dxa" w:w="3600"/>
-            <w:vAlign w:val="center"/>
-          </w:tcPr>
-          <w:p>
-            <w:pPr>
-              <w:spacing w:after="0"/>
-            </w:pPr>
-            <w:r/>
-            <w:r>
-              <w:rPr>
-                <w:rFonts w:ascii="Calibri" w:hAnsi="Calibri"/>
-                <w:b w:val="0"/>
-                <w:sz w:val="20"/>
-              </w:rPr>
-              <w:t>Not implemented yet.</w:t>
-            </w:r>
-          </w:p>
-        </w:tc>
-        <w:tc>
-          <w:tcPr>
-            <w:tcW w:type="dxa" w:w="3312"/>
-            <w:vAlign w:val="center"/>
-          </w:tcPr>
-          <w:p>
-            <w:pPr>
-              <w:spacing w:after="0"/>
-            </w:pPr>
-            <w:r/>
-            <w:r>
-              <w:rPr>
-                <w:rFonts w:ascii="Calibri" w:hAnsi="Calibri"/>
-                <w:b w:val="0"/>
-                <w:sz w:val="20"/>
-              </w:rPr>
-              <w:t>Use sync.openalex_works as the DAG command target.</w:t>
-            </w:r>
-          </w:p>
-        </w:tc>
-      </w:tr>
-      <w:tr>
-        <w:tc>
-          <w:tcPr>
-            <w:tcW w:type="dxa" w:w="2448"/>
-            <w:vAlign w:val="center"/>
-          </w:tcPr>
-          <w:p>
-            <w:pPr>
-              <w:spacing w:after="0"/>
-            </w:pPr>
-            <w:r/>
-            <w:r>
-              <w:rPr>
-                <w:rFonts w:ascii="Calibri" w:hAnsi="Calibri"/>
-                <w:b w:val="0"/>
-                <w:sz w:val="20"/>
-              </w:rPr>
-              <w:t>records_inserted naming</w:t>
-            </w:r>
-          </w:p>
-        </w:tc>
-        <w:tc>
-          <w:tcPr>
-            <w:tcW w:type="dxa" w:w="3600"/>
-            <w:vAlign w:val="center"/>
-          </w:tcPr>
-          <w:p>
-            <w:pPr>
-              <w:spacing w:after="0"/>
-            </w:pPr>
-            <w:r/>
-            <w:r>
-              <w:rPr>
-                <w:rFonts w:ascii="Calibri" w:hAnsi="Calibri"/>
-                <w:b w:val="0"/>
-                <w:sz w:val="20"/>
-              </w:rPr>
-              <w:t>Currently means changed raw records in some pipeline logs.</w:t>
-            </w:r>
-          </w:p>
-        </w:tc>
-        <w:tc>
-          <w:tcPr>
-            <w:tcW w:type="dxa" w:w="3312"/>
-            <w:vAlign w:val="center"/>
-          </w:tcPr>
-          <w:p>
-            <w:pPr>
-              <w:spacing w:after="0"/>
-            </w:pPr>
-            <w:r/>
-            <w:r>
-              <w:rPr>
-                <w:rFonts w:ascii="Calibri" w:hAnsi="Calibri"/>
-                <w:b w:val="0"/>
-                <w:sz w:val="20"/>
-              </w:rPr>
-              <w:t>Consider renaming to records_changed in a later DB version.</w:t>
-            </w:r>
-          </w:p>
-        </w:tc>
-      </w:tr>
-    </w:tbl>
-    <w:p/>
+    <w:p>
+      <w:pPr>
+        <w:pStyle w:val="ListBullet"/>
+      </w:pPr>
+      <w:r>
+        <w:t>Airflow task status là SUCCESS.</w:t>
+      </w:r>
+    </w:p>
+    <w:p>
+      <w:pPr>
+        <w:pStyle w:val="ListBullet"/>
+      </w:pPr>
+      <w:r>
+        <w:t>ops.job_runs có records_in/records_out hợp lý và records_failed thấp hoặc đã hiểu nguyên nhân.</w:t>
+      </w:r>
+    </w:p>
+    <w:p>
+      <w:pPr>
+        <w:pStyle w:val="ListBullet"/>
+      </w:pPr>
+      <w:r>
+        <w:t>ops.crawl_watermarks cập nhật đúng theo keyword/source.</w:t>
+      </w:r>
+    </w:p>
+    <w:p>
+      <w:pPr>
+        <w:pStyle w:val="ListBullet"/>
+      </w:pPr>
+      <w:r>
+        <w:t>Duplicate source mapping checks trả về 0 dòng.</w:t>
+      </w:r>
+    </w:p>
+    <w:p>
+      <w:pPr>
+        <w:pStyle w:val="ListBullet"/>
+      </w:pPr>
+      <w:r>
+        <w:t>core.papers, core.authors, core.journals tăng theo kỳ vọng.</w:t>
+      </w:r>
+    </w:p>
     <w:p>
       <w:pPr>
         <w:pStyle w:val="Heading1"/>
       </w:pPr>
       <w:r>
-        <w:t>8. Recommended Local Operating Pattern</w:t>
+        <w:t>8. Hướng Scale</w:t>
       </w:r>
     </w:p>
     <w:p>
       <w:pPr>
-        <w:pStyle w:val="ListNumber"/>
+        <w:pStyle w:val="ListBullet"/>
       </w:pPr>
       <w:r>
-        <w:t>Use small sync runs while developing: per_page 25 and max-pages-per-keyword 1.</w:t>
+        <w:t>Không gộp tất cả sources vào một DAG lớn.</w:t>
       </w:r>
     </w:p>
     <w:p>
       <w:pPr>
-        <w:pStyle w:val="ListNumber"/>
+        <w:pStyle w:val="ListBullet"/>
       </w:pPr>
       <w:r>
-        <w:t>Check ops.crawl_watermarks after each run to confirm initial, resume, or incremental mode.</w:t>
+        <w:t>Tách OpenAlex, Crossref, Semantic Scholar thành các DAG riêng.</w:t>
       </w:r>
     </w:p>
     <w:p>
       <w:pPr>
-        <w:pStyle w:val="ListNumber"/>
+        <w:pStyle w:val="ListBullet"/>
       </w:pPr>
       <w:r>
-        <w:t>Use enrich-authors and enrich-sources only after works processing succeeds.</w:t>
+        <w:t>Dùng canonical merge DAG để xử lý duplicate papers và source priority.</w:t>
       </w:r>
     </w:p>
     <w:p>
       <w:pPr>
-        <w:pStyle w:val="ListNumber"/>
+        <w:pStyle w:val="ListBullet"/>
       </w:pPr>
       <w:r>
-        <w:t>Do not manually chase a large initial cursor forever; let the orchestrator resume over repeated scheduled runs.</w:t>
+        <w:t>Tăng enrich limit trước nếu backlog author/source tăng nhanh.</w:t>
       </w:r>
     </w:p>
     <w:p>
       <w:pPr>
-        <w:pStyle w:val="ListNumber"/>
+        <w:pStyle w:val="ListBullet"/>
       </w:pPr>
       <w:r>
-        <w:t>Keep database timestamps in Vietnam time as defined in database ver 7.sql.</w:t>
+        <w:t>Chỉ tăng per-page hoặc max-pages sau nhiều run ổn định.</w:t>
       </w:r>
     </w:p>
     <w:sectPr>
-      <w:footerReference w:type="default" r:id="rId9"/>
       <w:pgSz w:w="12240" w:h="15840"/>
       <w:pgMar w:top="1440" w:right="1440" w:bottom="1440" w:left="1440" w:header="720" w:footer="720" w:gutter="0"/>
       <w:cols w:space="720"/>
@@ -3229,23 +1304,6 @@
     </w:sectPr>
   </w:body>
 </w:document>
-</file>
-
-<file path=word/footer1.xml><?xml version="1.0" encoding="utf-8"?>
-<w:ftr xmlns:m="http://schemas.openxmlformats.org/officeDocument/2006/math" xmlns:mc="http://schemas.openxmlformats.org/markup-compatibility/2006" xmlns:mo="http://schemas.microsoft.com/office/mac/office/2008/main" xmlns:mv="urn:schemas-microsoft-com:mac:vml" xmlns:o="urn:schemas-microsoft-com:office:office" xmlns:r="http://schemas.openxmlformats.org/officeDocument/2006/relationships" xmlns:v="urn:schemas-microsoft-com:vml" xmlns:w10="urn:schemas-microsoft-com:office:word" xmlns:w14="http://schemas.microsoft.com/office/word/2010/wordml" xmlns:w="http://schemas.openxmlformats.org/wordprocessingml/2006/main" xmlns:wne="http://schemas.microsoft.com/office/word/2006/wordml" xmlns:wp14="http://schemas.microsoft.com/office/word/2010/wordprocessingDrawing" xmlns:wp="http://schemas.openxmlformats.org/drawingml/2006/wordprocessingDrawing" xmlns:wpc="http://schemas.microsoft.com/office/word/2010/wordprocessingCanvas" xmlns:wpg="http://schemas.microsoft.com/office/word/2010/wordprocessingGroup" xmlns:wpi="http://schemas.microsoft.com/office/word/2010/wordprocessingInk" xmlns:wps="http://schemas.microsoft.com/office/word/2010/wordprocessingShape" mc:Ignorable="w14 wp14">
-  <w:p>
-    <w:pPr>
-      <w:pStyle w:val="Footer"/>
-      <w:jc w:val="center"/>
-    </w:pPr>
-    <w:r>
-      <w:rPr>
-        <w:sz w:val="18"/>
-      </w:rPr>
-      <w:t>OpenAlex Pipeline Operations Guide - Database v7</w:t>
-    </w:r>
-  </w:p>
-</w:ftr>
 </file>
 
 <file path=word/numbering.xml><?xml version="1.0" encoding="utf-8"?>
@@ -3612,10 +1670,10 @@
     <w:qFormat/>
     <w:rsid w:val="00FC693F"/>
     <w:pPr>
-      <w:spacing w:after="120" w:line="300" w:lineRule="auto"/>
+      <w:spacing w:after="120" w:line="264" w:lineRule="auto"/>
     </w:pPr>
     <w:rPr>
-      <w:rFonts w:ascii="Calibri" w:hAnsi="Calibri" w:eastAsia="Calibri"/>
+      <w:rFonts w:ascii="Calibri" w:hAnsi="Calibri"/>
       <w:sz w:val="22"/>
     </w:rPr>
   </w:style>
@@ -3674,11 +1732,11 @@
     <w:pPr>
       <w:keepNext/>
       <w:keepLines/>
-      <w:spacing w:before="360" w:after="200"/>
+      <w:spacing w:before="200" w:after="100"/>
       <w:outlineLvl w:val="0"/>
     </w:pPr>
     <w:rPr>
-      <w:rFonts w:asciiTheme="majorHAnsi" w:eastAsiaTheme="majorEastAsia" w:hAnsiTheme="majorHAnsi" w:cstheme="majorBidi" w:ascii="Calibri" w:hAnsi="Calibri" w:eastAsia="Calibri"/>
+      <w:rFonts w:asciiTheme="majorHAnsi" w:eastAsiaTheme="majorEastAsia" w:hAnsiTheme="majorHAnsi" w:cstheme="majorBidi" w:ascii="Calibri" w:hAnsi="Calibri"/>
       <w:b/>
       <w:bCs/>
       <w:color w:val="2E74B5"/>
@@ -3698,11 +1756,11 @@
     <w:pPr>
       <w:keepNext/>
       <w:keepLines/>
-      <w:spacing w:before="280" w:after="140"/>
+      <w:spacing w:before="200" w:after="100"/>
       <w:outlineLvl w:val="1"/>
     </w:pPr>
     <w:rPr>
-      <w:rFonts w:asciiTheme="majorHAnsi" w:eastAsiaTheme="majorEastAsia" w:hAnsiTheme="majorHAnsi" w:cstheme="majorBidi" w:ascii="Calibri" w:hAnsi="Calibri" w:eastAsia="Calibri"/>
+      <w:rFonts w:asciiTheme="majorHAnsi" w:eastAsiaTheme="majorEastAsia" w:hAnsiTheme="majorHAnsi" w:cstheme="majorBidi" w:ascii="Calibri" w:hAnsi="Calibri"/>
       <w:b/>
       <w:bCs/>
       <w:color w:val="2E74B5"/>
@@ -3726,7 +1784,7 @@
       <w:outlineLvl w:val="2"/>
     </w:pPr>
     <w:rPr>
-      <w:rFonts w:asciiTheme="majorHAnsi" w:eastAsiaTheme="majorEastAsia" w:hAnsiTheme="majorHAnsi" w:cstheme="majorBidi" w:ascii="Calibri" w:hAnsi="Calibri" w:eastAsia="Calibri"/>
+      <w:rFonts w:asciiTheme="majorHAnsi" w:eastAsiaTheme="majorEastAsia" w:hAnsiTheme="majorHAnsi" w:cstheme="majorBidi" w:ascii="Calibri" w:hAnsi="Calibri"/>
       <w:b/>
       <w:bCs/>
       <w:color w:val="1F4D78"/>
@@ -3964,15 +2022,15 @@
       <w:pBdr>
         <w:bottom w:val="single" w:sz="8" w:space="4" w:color="4F81BD" w:themeColor="accent1"/>
       </w:pBdr>
-      <w:spacing w:after="160" w:line="240" w:lineRule="auto" w:before="0"/>
+      <w:spacing w:after="300" w:line="240" w:lineRule="auto"/>
       <w:contextualSpacing/>
     </w:pPr>
     <w:rPr>
-      <w:rFonts w:asciiTheme="majorHAnsi" w:eastAsiaTheme="majorEastAsia" w:hAnsiTheme="majorHAnsi" w:cstheme="majorBidi" w:ascii="Calibri" w:hAnsi="Calibri" w:eastAsia="Calibri"/>
-      <w:color w:val="1F4D78"/>
+      <w:rFonts w:asciiTheme="majorHAnsi" w:eastAsiaTheme="majorEastAsia" w:hAnsiTheme="majorHAnsi" w:cstheme="majorBidi"/>
+      <w:color w:val="17365D" w:themeColor="text2" w:themeShade="BF"/>
       <w:spacing w:val="5"/>
       <w:kern w:val="28"/>
-      <w:sz w:val="40"/>
+      <w:sz w:val="52"/>
       <w:szCs w:val="52"/>
     </w:rPr>
   </w:style>
@@ -4003,15 +2061,14 @@
       <w:numPr>
         <w:ilvl w:val="1"/>
       </w:numPr>
-      <w:spacing w:before="0" w:after="280"/>
     </w:pPr>
     <w:rPr>
-      <w:rFonts w:asciiTheme="majorHAnsi" w:eastAsiaTheme="majorEastAsia" w:hAnsiTheme="majorHAnsi" w:cstheme="majorBidi" w:ascii="Calibri" w:hAnsi="Calibri" w:eastAsia="Calibri"/>
+      <w:rFonts w:asciiTheme="majorHAnsi" w:eastAsiaTheme="majorEastAsia" w:hAnsiTheme="majorHAnsi" w:cstheme="majorBidi"/>
       <w:i/>
       <w:iCs/>
-      <w:color w:val="666666"/>
+      <w:color w:val="4F81BD" w:themeColor="accent1"/>
       <w:spacing w:val="15"/>
-      <w:sz w:val="22"/>
+      <w:sz w:val="24"/>
       <w:szCs w:val="24"/>
     </w:rPr>
   </w:style>
@@ -15302,28 +13359,6 @@
         <w:shd w:val="clear" w:color="auto" w:fill="FBCAA2" w:themeFill="accent6" w:themeFillTint="7F"/>
       </w:tcPr>
     </w:tblStylePr>
-  </w:style>
-  <w:style w:type="paragraph" w:customStyle="1" w:styleId="CodeBlock">
-    <w:name w:val="Code Block"/>
-    <w:pPr>
-      <w:spacing w:before="60" w:after="120"/>
-      <w:ind w:left="360"/>
-    </w:pPr>
-    <w:rPr>
-      <w:rFonts w:ascii="Consolas" w:hAnsi="Consolas" w:eastAsia="Consolas"/>
-      <w:sz w:val="18"/>
-    </w:rPr>
-  </w:style>
-  <w:style w:type="paragraph" w:customStyle="1" w:styleId="Callout">
-    <w:name w:val="Callout"/>
-    <w:pPr>
-      <w:spacing w:before="120" w:after="160"/>
-      <w:ind w:left="288" w:right="288"/>
-    </w:pPr>
-    <w:rPr>
-      <w:rFonts w:ascii="Calibri" w:hAnsi="Calibri"/>
-      <w:sz w:val="20"/>
-    </w:rPr>
   </w:style>
 </w:styles>
 </file>

</xml_diff>